<commit_message>
Complete CV downloads with patents full awards and quantified project record
</commit_message>
<xml_diff>
--- a/assets/files/Tianlong_Wang_CV.docx
+++ b/assets/files/Tianlong_Wang_CV.docx
@@ -120,7 +120,20 @@
         <w:t xml:space="preserve">Research outputs: </w:t>
       </w:r>
       <w:r>
-        <w:t>19 published papers (18 journal articles and 1 conference paper); 5 manuscripts under review; 3 investigator-led research awards totalling RMB 126,000; 6 open-source research software projects.</w:t>
+        <w:t>19 published papers (18 journal articles and 1 conference paper); 5 manuscripts under review; 8 invention-patent records (3 grant publications and 5 application publications); 6 open-source research software projects.</w:t>
+      </w:r>
+    </w:p>
+    <w:p>
+      <w:pPr>
+        <w:keepNext w:val="0"/>
+        <w:keepLines/>
+        <w:jc w:val="both"/>
+      </w:pPr>
+      <w:r>
+        <w:rPr>
+          <w:b w:val="0"/>
+        </w:rPr>
+        <w:t>Lead investigator on 6 research and innovation projects, including 4 funded awards with recorded support totalling RMB 136,000; contributor to 7 collaborative projects; separate CSC joint-training support of RMB 300,000. The record includes 10 honors and scholarship entries and 12 competition-award entries; reviewer for 16 journals and member of 3 professional societies.</w:t>
       </w:r>
     </w:p>
     <w:p>
@@ -234,7 +247,7 @@
         <w:pStyle w:val="Heading2"/>
       </w:pPr>
       <w:r>
-        <w:t>Investigator-led research awards</w:t>
+        <w:t>Investigator-led research and innovation projects 6</w:t>
       </w:r>
     </w:p>
     <w:p>
@@ -314,10 +327,24 @@
     </w:p>
     <w:p>
       <w:pPr>
-        <w:pStyle w:val="Heading2"/>
+        <w:keepNext w:val="0"/>
+        <w:keepLines/>
+        <w:ind w:left="317" w:hanging="317"/>
+        <w:jc w:val="both"/>
       </w:pPr>
       <w:r>
-        <w:t>Collaborative research projects</w:t>
+        <w:rPr>
+          <w:b w:val="0"/>
+        </w:rPr>
+      </w:r>
+      <w:r>
+        <w:t xml:space="preserve">4. </w:t>
+      </w:r>
+      <w:r>
+        <w:t>SLOPE GUARD: Integrated Landslide Monitoring and Drainage Solution Provider; China International College Students' Innovation Competition, Singapore Regional project; RMB 10,000; project 00006; completed with distinction</w:t>
+      </w:r>
+      <w:r>
+        <w:t>; 2025.06–2025.11</w:t>
       </w:r>
     </w:p>
     <w:p>
@@ -333,17 +360,12 @@
         </w:rPr>
       </w:r>
       <w:r>
-        <w:t xml:space="preserve">1. </w:t>
-      </w:r>
-      <w:r>
-        <w:rPr>
-          <w:b/>
-        </w:rPr>
-        <w:t>Early Forecasting and Disaster Control Methods for Debris Flows in Small Watersheds Based on Hydrodynamic Analysis</w:t>
-      </w:r>
-      <w:r>
-        <w:t>. National Natural Science Foundation of China, Key Program; Core team member; January 2023 — December 2027. Grant No. 42230702.</w:t>
-      </w:r>
+        <w:t xml:space="preserve">5. </w:t>
+      </w:r>
+      <w:r>
+        <w:t>Application of magnetic fluids to visualized fracture seepage and grouting-based seepage control; university research project; completed with distinction</w:t>
+      </w:r>
+      <w:r/>
     </w:p>
     <w:p>
       <w:pPr>
@@ -358,6 +380,59 @@
         </w:rPr>
       </w:r>
       <w:r>
+        <w:t xml:space="preserve">6. </w:t>
+      </w:r>
+      <w:r>
+        <w:t>Energy dissipation, load reduction and reliability of flexible cushion layers for gravity retaining walls; university research project; completed with distinction</w:t>
+      </w:r>
+      <w:r/>
+    </w:p>
+    <w:p>
+      <w:pPr>
+        <w:pStyle w:val="Heading2"/>
+      </w:pPr>
+      <w:r>
+        <w:t>Collaborative research projects 7</w:t>
+      </w:r>
+    </w:p>
+    <w:p>
+      <w:pPr>
+        <w:keepNext w:val="0"/>
+        <w:keepLines/>
+        <w:ind w:left="317" w:hanging="317"/>
+        <w:jc w:val="both"/>
+      </w:pPr>
+      <w:r>
+        <w:rPr>
+          <w:b w:val="0"/>
+        </w:rPr>
+      </w:r>
+      <w:r>
+        <w:t xml:space="preserve">1. </w:t>
+      </w:r>
+      <w:r>
+        <w:rPr>
+          <w:b/>
+        </w:rPr>
+        <w:t>Early Forecasting and Disaster Control Methods for Debris Flows in Small Watersheds Based on Hydrodynamic Analysis</w:t>
+      </w:r>
+      <w:r>
+        <w:t>. National Natural Science Foundation of China, Key Program; Core team member; January 2023 — December 2027. Grant No. 42230702.</w:t>
+      </w:r>
+    </w:p>
+    <w:p>
+      <w:pPr>
+        <w:keepNext w:val="0"/>
+        <w:keepLines/>
+        <w:ind w:left="317" w:hanging="317"/>
+        <w:jc w:val="both"/>
+      </w:pPr>
+      <w:r>
+        <w:rPr>
+          <w:b w:val="0"/>
+        </w:rPr>
+      </w:r>
+      <w:r>
         <w:t xml:space="preserve">2. </w:t>
       </w:r>
       <w:r>
@@ -368,6 +443,122 @@
       </w:r>
       <w:r>
         <w:t>. National Natural Science Foundation of China, Young Scientists Fund; Core team member; January 2019 — December 2021. Grant No. 51809151. Completed.</w:t>
+      </w:r>
+    </w:p>
+    <w:p>
+      <w:pPr>
+        <w:keepNext w:val="0"/>
+        <w:keepLines/>
+        <w:ind w:left="317" w:hanging="317"/>
+        <w:jc w:val="both"/>
+      </w:pPr>
+      <w:r>
+        <w:rPr>
+          <w:b w:val="0"/>
+        </w:rPr>
+      </w:r>
+      <w:r>
+        <w:t xml:space="preserve">3. </w:t>
+      </w:r>
+      <w:r>
+        <w:t>Geomechanical mechanisms of collapse and landslide hazards on steep slopes under climate change; CAST Young Elite Scientists Sponsorship Program; Core team member.</w:t>
+      </w:r>
+    </w:p>
+    <w:p>
+      <w:pPr>
+        <w:keepNext w:val="0"/>
+        <w:keepLines/>
+        <w:ind w:left="317" w:hanging="317"/>
+        <w:jc w:val="both"/>
+      </w:pPr>
+      <w:r>
+        <w:rPr>
+          <w:b w:val="0"/>
+        </w:rPr>
+      </w:r>
+      <w:r>
+        <w:t xml:space="preserve">4. </w:t>
+      </w:r>
+      <w:r>
+        <w:t>Novel drainage treatment technologies for soft soil; major provincial commissioned research project; completed with distinction; Core team member.</w:t>
+      </w:r>
+    </w:p>
+    <w:p>
+      <w:pPr>
+        <w:keepNext w:val="0"/>
+        <w:keepLines/>
+        <w:ind w:left="317" w:hanging="317"/>
+        <w:jc w:val="both"/>
+      </w:pPr>
+      <w:r>
+        <w:rPr>
+          <w:b w:val="0"/>
+        </w:rPr>
+      </w:r>
+      <w:r>
+        <w:t xml:space="preserve">5. </w:t>
+      </w:r>
+      <w:r>
+        <w:t>Smart monitoring system for digitally instrumented towers; provincial student innovation project; completed with distinction; Core team member.</w:t>
+      </w:r>
+    </w:p>
+    <w:p>
+      <w:pPr>
+        <w:keepNext w:val="0"/>
+        <w:keepLines/>
+        <w:ind w:left="317" w:hanging="317"/>
+        <w:jc w:val="both"/>
+      </w:pPr>
+      <w:r>
+        <w:rPr>
+          <w:b w:val="0"/>
+        </w:rPr>
+      </w:r>
+      <w:r>
+        <w:t xml:space="preserve">6. </w:t>
+      </w:r>
+      <w:r>
+        <w:t>Innovative methods and technologies for slope protection and treatment; provincial student innovation project; completed with distinction; Core team member.</w:t>
+      </w:r>
+    </w:p>
+    <w:p>
+      <w:pPr>
+        <w:keepNext w:val="0"/>
+        <w:keepLines/>
+        <w:ind w:left="317" w:hanging="317"/>
+        <w:jc w:val="both"/>
+      </w:pPr>
+      <w:r>
+        <w:rPr>
+          <w:b w:val="0"/>
+        </w:rPr>
+      </w:r>
+      <w:r>
+        <w:t xml:space="preserve">7. </w:t>
+      </w:r>
+      <w:r>
+        <w:t>Integrated space-air-ground landslide monitoring and siphon-drainage mitigation system; provincial student innovation project; completed with distinction; Core team member.</w:t>
+      </w:r>
+    </w:p>
+    <w:p>
+      <w:pPr>
+        <w:pStyle w:val="Heading2"/>
+      </w:pPr>
+      <w:r>
+        <w:t>Joint doctoral training scholarship 1</w:t>
+      </w:r>
+    </w:p>
+    <w:p>
+      <w:pPr>
+        <w:keepNext w:val="0"/>
+        <w:keepLines/>
+        <w:jc w:val="both"/>
+      </w:pPr>
+      <w:r>
+        <w:rPr>
+          <w:b w:val="0"/>
+        </w:rPr>
+        <w:t>China Scholarship Council, National Construction of High-Level Universities Program; Sep 2024 - Sep 2026; RMB 300,000; grant 202406320358; scholarship recipient.</w:t>
       </w:r>
     </w:p>
     <w:p>
@@ -378,7 +569,7 @@
         </w:pBdr>
       </w:pPr>
       <w:r>
-        <w:t>Manuscripts under review</w:t>
+        <w:t>Manuscripts under review 5</w:t>
       </w:r>
     </w:p>
     <w:p>
@@ -589,7 +780,7 @@
         </w:pBdr>
       </w:pPr>
       <w:r>
-        <w:t>Published papers</w:t>
+        <w:t>Published papers 19</w:t>
       </w:r>
     </w:p>
     <w:p>
@@ -1526,7 +1717,15 @@
         </w:pBdr>
       </w:pPr>
       <w:r>
-        <w:t>Open-source research software</w:t>
+        <w:t>Invention patents and applications 8</w:t>
+      </w:r>
+    </w:p>
+    <w:p>
+      <w:pPr>
+        <w:pStyle w:val="Heading2"/>
+      </w:pPr>
+      <w:r>
+        <w:t>Grant publications 3</w:t>
       </w:r>
     </w:p>
     <w:p>
@@ -1545,6 +1744,341 @@
         <w:t xml:space="preserve">1. </w:t>
       </w:r>
       <w:r>
+        <w:t xml:space="preserve">J. Liu, Z. Li, </w:t>
+      </w:r>
+      <w:r>
+        <w:rPr>
+          <w:b/>
+          <w:u w:val="single"/>
+        </w:rPr>
+        <w:t>Tianlong Wang</w:t>
+      </w:r>
+      <w:r>
+        <w:t>, et al.</w:t>
+      </w:r>
+      <w:r>
+        <w:t xml:space="preserve">. Eccentric Hook-shaped Expansible Pre-stressed Anchoring Structure and Its Anchoring Method. China; CN113718767B; 2023. </w:t>
+      </w:r>
+      <w:hyperlink r:id="rId33">
+        <w:r>
+          <w:rPr>
+            <w:color w:val="183F92"/>
+          </w:rPr>
+          <w:t>Patent record</w:t>
+        </w:r>
+      </w:hyperlink>
+    </w:p>
+    <w:p>
+      <w:pPr>
+        <w:keepNext w:val="0"/>
+        <w:keepLines/>
+        <w:ind w:left="317" w:hanging="317"/>
+        <w:jc w:val="both"/>
+      </w:pPr>
+      <w:r>
+        <w:rPr>
+          <w:b w:val="0"/>
+        </w:rPr>
+      </w:r>
+      <w:r>
+        <w:t xml:space="preserve">2. </w:t>
+      </w:r>
+      <w:r>
+        <w:t xml:space="preserve">J. Liu, Q. Shi, Z. Wei, S. Li, L. Tang, </w:t>
+      </w:r>
+      <w:r>
+        <w:rPr>
+          <w:b/>
+          <w:u w:val="single"/>
+        </w:rPr>
+        <w:t>Tianlong Wang</w:t>
+      </w:r>
+      <w:r>
+        <w:t>, et al.</w:t>
+      </w:r>
+      <w:r>
+        <w:t xml:space="preserve">. Device and Method for Obtaining the Position of Liquid Displacement Surface in Rock Cracks. China; CN111595550B; 2022. </w:t>
+      </w:r>
+      <w:hyperlink r:id="rId34">
+        <w:r>
+          <w:rPr>
+            <w:color w:val="183F92"/>
+          </w:rPr>
+          <w:t>Patent record</w:t>
+        </w:r>
+      </w:hyperlink>
+    </w:p>
+    <w:p>
+      <w:pPr>
+        <w:keepNext w:val="0"/>
+        <w:keepLines/>
+        <w:ind w:left="317" w:hanging="317"/>
+        <w:jc w:val="both"/>
+      </w:pPr>
+      <w:r>
+        <w:rPr>
+          <w:b w:val="0"/>
+        </w:rPr>
+      </w:r>
+      <w:r>
+        <w:t xml:space="preserve">3. </w:t>
+      </w:r>
+      <w:r>
+        <w:t xml:space="preserve">J. Liu, Q. Shi, Z. Wei, S. Li, L. Tang, </w:t>
+      </w:r>
+      <w:r>
+        <w:rPr>
+          <w:b/>
+          <w:u w:val="single"/>
+        </w:rPr>
+        <w:t>Tianlong Wang</w:t>
+      </w:r>
+      <w:r>
+        <w:t>, et al.</w:t>
+      </w:r>
+      <w:r>
+        <w:t xml:space="preserve">. Pile Structure and Construction Method in Coral Sand Environment. China; CN110886291B; 2021. </w:t>
+      </w:r>
+      <w:hyperlink r:id="rId35">
+        <w:r>
+          <w:rPr>
+            <w:color w:val="183F92"/>
+          </w:rPr>
+          <w:t>Patent record</w:t>
+        </w:r>
+      </w:hyperlink>
+    </w:p>
+    <w:p>
+      <w:pPr>
+        <w:pStyle w:val="Heading2"/>
+      </w:pPr>
+      <w:r>
+        <w:t>Published applications 5</w:t>
+      </w:r>
+    </w:p>
+    <w:p>
+      <w:pPr>
+        <w:keepNext w:val="0"/>
+        <w:keepLines/>
+        <w:ind w:left="317" w:hanging="317"/>
+        <w:jc w:val="both"/>
+      </w:pPr>
+      <w:r>
+        <w:rPr>
+          <w:b w:val="0"/>
+        </w:rPr>
+      </w:r>
+      <w:r>
+        <w:t xml:space="preserve">1. </w:t>
+      </w:r>
+      <w:r>
+        <w:t xml:space="preserve">H. Sun, X. Wang, </w:t>
+      </w:r>
+      <w:r>
+        <w:rPr>
+          <w:b/>
+          <w:u w:val="single"/>
+        </w:rPr>
+        <w:t>Tianlong Wang</w:t>
+      </w:r>
+      <w:r>
+        <w:t>, R. Tang, R. Luo</w:t>
+      </w:r>
+      <w:r>
+        <w:t xml:space="preserve">. Monitoring and Early Warning Method and System for Rainfall-induced Landslides. Japan; application 2024-017304; JP2025113090A; 2025. </w:t>
+      </w:r>
+      <w:hyperlink r:id="rId36">
+        <w:r>
+          <w:rPr>
+            <w:color w:val="183F92"/>
+          </w:rPr>
+          <w:t>Patent record</w:t>
+        </w:r>
+      </w:hyperlink>
+    </w:p>
+    <w:p>
+      <w:pPr>
+        <w:keepNext w:val="0"/>
+        <w:keepLines/>
+        <w:ind w:left="317" w:hanging="317"/>
+        <w:jc w:val="both"/>
+      </w:pPr>
+      <w:r>
+        <w:rPr>
+          <w:b w:val="0"/>
+        </w:rPr>
+      </w:r>
+      <w:r>
+        <w:t xml:space="preserve">2. </w:t>
+      </w:r>
+      <w:r>
+        <w:t xml:space="preserve">X. Wang, H. Sun, S. Shao, R. Luo, </w:t>
+      </w:r>
+      <w:r>
+        <w:rPr>
+          <w:b/>
+          <w:u w:val="single"/>
+        </w:rPr>
+        <w:t>Tianlong Wang</w:t>
+      </w:r>
+      <w:r/>
+      <w:r>
+        <w:t xml:space="preserve">. Early Warning and Mitigation Method for Debris Flow Disasters in Small Watersheds. China; CN118262481A; 2024. </w:t>
+      </w:r>
+      <w:hyperlink r:id="rId37">
+        <w:r>
+          <w:rPr>
+            <w:color w:val="183F92"/>
+          </w:rPr>
+          <w:t>Patent record</w:t>
+        </w:r>
+      </w:hyperlink>
+    </w:p>
+    <w:p>
+      <w:pPr>
+        <w:keepNext w:val="0"/>
+        <w:keepLines/>
+        <w:ind w:left="317" w:hanging="317"/>
+        <w:jc w:val="both"/>
+      </w:pPr>
+      <w:r>
+        <w:rPr>
+          <w:b w:val="0"/>
+        </w:rPr>
+      </w:r>
+      <w:r>
+        <w:t xml:space="preserve">3. </w:t>
+      </w:r>
+      <w:r>
+        <w:t xml:space="preserve">X. Wang, H. Sun, </w:t>
+      </w:r>
+      <w:r>
+        <w:rPr>
+          <w:b/>
+          <w:u w:val="single"/>
+        </w:rPr>
+        <w:t>Tianlong Wang</w:t>
+      </w:r>
+      <w:r>
+        <w:t>, R. Tang, R. Luo</w:t>
+      </w:r>
+      <w:r>
+        <w:t xml:space="preserve">. Monitoring and Early Warning Method and System for Rainfall-induced Landslides. China; CN117854239A; 2024. </w:t>
+      </w:r>
+      <w:hyperlink r:id="rId38">
+        <w:r>
+          <w:rPr>
+            <w:color w:val="183F92"/>
+          </w:rPr>
+          <w:t>Patent record</w:t>
+        </w:r>
+      </w:hyperlink>
+    </w:p>
+    <w:p>
+      <w:pPr>
+        <w:keepNext w:val="0"/>
+        <w:keepLines/>
+        <w:ind w:left="317" w:hanging="317"/>
+        <w:jc w:val="both"/>
+      </w:pPr>
+      <w:r>
+        <w:rPr>
+          <w:b w:val="0"/>
+        </w:rPr>
+      </w:r>
+      <w:r>
+        <w:t xml:space="preserve">4. </w:t>
+      </w:r>
+      <w:r/>
+      <w:r>
+        <w:rPr>
+          <w:b/>
+          <w:u w:val="single"/>
+        </w:rPr>
+        <w:t>Tianlong Wang</w:t>
+      </w:r>
+      <w:r>
+        <w:t>, H. Sun, Z. Chu, R. Luo, X. Wang</w:t>
+      </w:r>
+      <w:r>
+        <w:t xml:space="preserve">. Landslide Displacement Prediction Method Based on IVMD-IAO-BiLSTM. China; CN116757323A; 2023. </w:t>
+      </w:r>
+      <w:hyperlink r:id="rId39">
+        <w:r>
+          <w:rPr>
+            <w:color w:val="183F92"/>
+          </w:rPr>
+          <w:t>Patent record</w:t>
+        </w:r>
+      </w:hyperlink>
+    </w:p>
+    <w:p>
+      <w:pPr>
+        <w:keepNext w:val="0"/>
+        <w:keepLines/>
+        <w:ind w:left="317" w:hanging="317"/>
+        <w:jc w:val="both"/>
+      </w:pPr>
+      <w:r>
+        <w:rPr>
+          <w:b w:val="0"/>
+        </w:rPr>
+      </w:r>
+      <w:r>
+        <w:t xml:space="preserve">5. </w:t>
+      </w:r>
+      <w:r>
+        <w:t xml:space="preserve">J. Liu, Z. Li, </w:t>
+      </w:r>
+      <w:r>
+        <w:rPr>
+          <w:b/>
+          <w:u w:val="single"/>
+        </w:rPr>
+        <w:t>Tianlong Wang</w:t>
+      </w:r>
+      <w:r>
+        <w:t>, et al.</w:t>
+      </w:r>
+      <w:r>
+        <w:t xml:space="preserve">. Method for Repairing Dam Crack Defects Using Magnetic Mortar. China; CN114396022A; 2022. </w:t>
+      </w:r>
+      <w:hyperlink r:id="rId40">
+        <w:r>
+          <w:rPr>
+            <w:color w:val="183F92"/>
+          </w:rPr>
+          <w:t>Patent record</w:t>
+        </w:r>
+      </w:hyperlink>
+    </w:p>
+    <w:p>
+      <w:pPr>
+        <w:pStyle w:val="Heading1"/>
+        <w:pBdr>
+          <w:bottom w:val="single" w:sz="4" w:color="777777" w:space="3"/>
+        </w:pBdr>
+      </w:pPr>
+      <w:r>
+        <w:t>Open-source research software 6</w:t>
+      </w:r>
+    </w:p>
+    <w:p>
+      <w:pPr>
+        <w:keepNext w:val="0"/>
+        <w:keepLines/>
+        <w:ind w:left="317" w:hanging="317"/>
+        <w:jc w:val="both"/>
+      </w:pPr>
+      <w:r>
+        <w:rPr>
+          <w:b w:val="0"/>
+        </w:rPr>
+      </w:r>
+      <w:r>
+        <w:t xml:space="preserve">1. </w:t>
+      </w:r>
+      <w:r>
         <w:rPr>
           <w:b/>
         </w:rPr>
@@ -1556,7 +2090,7 @@
       <w:r>
         <w:t xml:space="preserve"> </w:t>
       </w:r>
-      <w:hyperlink r:id="rId33">
+      <w:hyperlink r:id="rId41">
         <w:r>
           <w:rPr>
             <w:color w:val="183F92"/>
@@ -1592,7 +2126,7 @@
       <w:r>
         <w:t xml:space="preserve"> </w:t>
       </w:r>
-      <w:hyperlink r:id="rId34">
+      <w:hyperlink r:id="rId42">
         <w:r>
           <w:rPr>
             <w:color w:val="183F92"/>
@@ -1628,7 +2162,7 @@
       <w:r>
         <w:t xml:space="preserve"> </w:t>
       </w:r>
-      <w:hyperlink r:id="rId35">
+      <w:hyperlink r:id="rId43">
         <w:r>
           <w:rPr>
             <w:color w:val="183F92"/>
@@ -1664,7 +2198,7 @@
       <w:r>
         <w:t xml:space="preserve"> </w:t>
       </w:r>
-      <w:hyperlink r:id="rId36">
+      <w:hyperlink r:id="rId44">
         <w:r>
           <w:rPr>
             <w:color w:val="183F92"/>
@@ -1700,7 +2234,7 @@
       <w:r>
         <w:t xml:space="preserve"> </w:t>
       </w:r>
-      <w:hyperlink r:id="rId37">
+      <w:hyperlink r:id="rId45">
         <w:r>
           <w:rPr>
             <w:color w:val="183F92"/>
@@ -1736,7 +2270,7 @@
       <w:r>
         <w:t xml:space="preserve"> </w:t>
       </w:r>
-      <w:hyperlink r:id="rId38">
+      <w:hyperlink r:id="rId46">
         <w:r>
           <w:rPr>
             <w:color w:val="183F92"/>
@@ -1787,7 +2321,12 @@
         <w:rPr>
           <w:b w:val="0"/>
         </w:rPr>
-        <w:t>Memberships: Chinese Society for Rock Mechanics and Engineering; Geological Society of China; China Civil Engineering Society.</w:t>
+        <w:t>Professional memberships (3): Chinese Society for Rock Mechanics and Engineering; Geological Society of China; China Civil Engineering Society.</w:t>
+      </w:r>
+    </w:p>
+    <w:p>
+      <w:r>
+        <w:br w:type="page"/>
       </w:r>
     </w:p>
     <w:p>
@@ -1798,7 +2337,15 @@
         </w:pBdr>
       </w:pPr>
       <w:r>
-        <w:t>Honors and awards</w:t>
+        <w:t>Honors scholarships and competition awards 22 entries</w:t>
+      </w:r>
+    </w:p>
+    <w:p>
+      <w:pPr>
+        <w:pStyle w:val="Heading2"/>
+      </w:pPr>
+      <w:r>
+        <w:t>Honors and scholarships 10 entries</w:t>
       </w:r>
     </w:p>
     <w:p>
@@ -1817,13 +2364,7 @@
         <w:t xml:space="preserve">1. </w:t>
       </w:r>
       <w:r>
-        <w:rPr>
-          <w:b/>
-        </w:rPr>
-        <w:t>National Scholarship</w:t>
-      </w:r>
-      <w:r>
-        <w:t>. China; 2025, 2021.</w:t>
+        <w:t>National Scholarship; 2025.</w:t>
       </w:r>
     </w:p>
     <w:p>
@@ -1842,13 +2383,7 @@
         <w:t xml:space="preserve">2. </w:t>
       </w:r>
       <w:r>
-        <w:rPr>
-          <w:b/>
-        </w:rPr>
-        <w:t>Outstanding Graduate</w:t>
-      </w:r>
-      <w:r>
-        <w:t>. Chinese Society for Rock Mechanics and Engineering · One of 100 recipients nationwide; 2022.</w:t>
+        <w:t>Chinese Government Scholarship, China Scholarship Council; 2024.</w:t>
       </w:r>
     </w:p>
     <w:p>
@@ -1867,13 +2402,7 @@
         <w:t xml:space="preserve">3. </w:t>
       </w:r>
       <w:r>
-        <w:rPr>
-          <w:b/>
-        </w:rPr>
-        <w:t>Silver Award</w:t>
-      </w:r>
-      <w:r>
-        <w:t>. China International College Students' Innovation Competition, Singapore Regional; 2025.</w:t>
+        <w:t>China Harbour Engineering Company Scholarship; 2023.</w:t>
       </w:r>
     </w:p>
     <w:p>
@@ -1892,17 +2421,467 @@
         <w:t xml:space="preserve">4. </w:t>
       </w:r>
       <w:r>
+        <w:t>Outstanding Graduate, Chinese Society for Rock Mechanics and Engineering; one of 100 recipients nationwide; 2022.</w:t>
+      </w:r>
+    </w:p>
+    <w:p>
+      <w:pPr>
+        <w:keepNext w:val="0"/>
+        <w:keepLines/>
+        <w:ind w:left="317" w:hanging="317"/>
+        <w:jc w:val="both"/>
+      </w:pPr>
+      <w:r>
         <w:rPr>
-          <w:b/>
+          <w:b w:val="0"/>
         </w:rPr>
-        <w:t>Grand Prize</w:t>
-      </w:r>
-      <w:r>
-        <w:t>. The 3rd National College Student Structural Design Information Technology Competition, China; 2021.</w:t>
+      </w:r>
+      <w:r>
+        <w:t xml:space="preserve">5. </w:t>
+      </w:r>
+      <w:r>
+        <w:t>Outstanding Graduate, university level; 2022.</w:t>
+      </w:r>
+    </w:p>
+    <w:p>
+      <w:pPr>
+        <w:keepNext w:val="0"/>
+        <w:keepLines/>
+        <w:ind w:left="317" w:hanging="317"/>
+        <w:jc w:val="both"/>
+      </w:pPr>
+      <w:r>
+        <w:rPr>
+          <w:b w:val="0"/>
+        </w:rPr>
+      </w:r>
+      <w:r>
+        <w:t xml:space="preserve">6. </w:t>
+      </w:r>
+      <w:r>
+        <w:t>Yunneng Electric Power Innovation Scholarship; 2022.</w:t>
+      </w:r>
+    </w:p>
+    <w:p>
+      <w:pPr>
+        <w:keepNext w:val="0"/>
+        <w:keepLines/>
+        <w:ind w:left="317" w:hanging="317"/>
+        <w:jc w:val="both"/>
+      </w:pPr>
+      <w:r>
+        <w:rPr>
+          <w:b w:val="0"/>
+        </w:rPr>
+      </w:r>
+      <w:r>
+        <w:t xml:space="preserve">7. </w:t>
+      </w:r>
+      <w:r>
+        <w:t>National Scholarship; 2021.</w:t>
+      </w:r>
+    </w:p>
+    <w:p>
+      <w:pPr>
+        <w:keepNext w:val="0"/>
+        <w:keepLines/>
+        <w:ind w:left="317" w:hanging="317"/>
+        <w:jc w:val="both"/>
+      </w:pPr>
+      <w:r>
+        <w:rPr>
+          <w:b w:val="0"/>
+        </w:rPr>
+      </w:r>
+      <w:r>
+        <w:t xml:space="preserve">8. </w:t>
+      </w:r>
+      <w:r>
+        <w:t>Wang Shuopeng Scholarship; 2020.</w:t>
+      </w:r>
+    </w:p>
+    <w:p>
+      <w:pPr>
+        <w:keepNext w:val="0"/>
+        <w:keepLines/>
+        <w:ind w:left="317" w:hanging="317"/>
+        <w:jc w:val="both"/>
+      </w:pPr>
+      <w:r>
+        <w:rPr>
+          <w:b w:val="0"/>
+        </w:rPr>
+      </w:r>
+      <w:r>
+        <w:t xml:space="preserve">9. </w:t>
+      </w:r>
+      <w:r>
+        <w:t>First-Class Academic Scholarship, four consecutive years; 2019–2022.</w:t>
+      </w:r>
+    </w:p>
+    <w:p>
+      <w:pPr>
+        <w:keepNext w:val="0"/>
+        <w:keepLines/>
+        <w:ind w:left="317" w:hanging="317"/>
+        <w:jc w:val="both"/>
+      </w:pPr>
+      <w:r>
+        <w:rPr>
+          <w:b w:val="0"/>
+        </w:rPr>
+      </w:r>
+      <w:r>
+        <w:t xml:space="preserve">10. </w:t>
+      </w:r>
+      <w:r>
+        <w:t>National Encouragement Scholarship, three consecutive years; 2019–2021.</w:t>
+      </w:r>
+    </w:p>
+    <w:p>
+      <w:pPr>
+        <w:pStyle w:val="Heading2"/>
+      </w:pPr>
+      <w:r>
+        <w:t>Competition awards 12 entries</w:t>
+      </w:r>
+    </w:p>
+    <w:p>
+      <w:pPr>
+        <w:keepNext w:val="0"/>
+        <w:keepLines/>
+        <w:ind w:left="317" w:hanging="317"/>
+        <w:jc w:val="both"/>
+      </w:pPr>
+      <w:r>
+        <w:rPr>
+          <w:b w:val="0"/>
+        </w:rPr>
+      </w:r>
+      <w:r>
+        <w:t xml:space="preserve">1. </w:t>
+      </w:r>
+      <w:r>
+        <w:t>Silver Award, China International College Students' Innovation Competition, Singapore Regional; 2025.</w:t>
+      </w:r>
+    </w:p>
+    <w:p>
+      <w:pPr>
+        <w:keepNext w:val="0"/>
+        <w:keepLines/>
+        <w:ind w:left="317" w:hanging="317"/>
+        <w:jc w:val="both"/>
+      </w:pPr>
+      <w:r>
+        <w:rPr>
+          <w:b w:val="0"/>
+        </w:rPr>
+      </w:r>
+      <w:r>
+        <w:t xml:space="preserve">2. </w:t>
+      </w:r>
+      <w:r>
+        <w:t>Silver Award, Zhejiang International College Students' Innovation Competition (Internet+); 2024.</w:t>
+      </w:r>
+    </w:p>
+    <w:p>
+      <w:pPr>
+        <w:keepNext w:val="0"/>
+        <w:keepLines/>
+        <w:ind w:left="317" w:hanging="317"/>
+        <w:jc w:val="both"/>
+      </w:pPr>
+      <w:r>
+        <w:rPr>
+          <w:b w:val="0"/>
+        </w:rPr>
+      </w:r>
+      <w:r>
+        <w:t xml:space="preserve">3. </w:t>
+      </w:r>
+      <w:r>
+        <w:t>Bronze Award, 14th Challenge Cup Zhejiang Undergraduate Entrepreneurship Plan Competition; 2024.</w:t>
+      </w:r>
+    </w:p>
+    <w:p>
+      <w:pPr>
+        <w:keepNext w:val="0"/>
+        <w:keepLines/>
+        <w:ind w:left="317" w:hanging="317"/>
+        <w:jc w:val="both"/>
+      </w:pPr>
+      <w:r>
+        <w:rPr>
+          <w:b w:val="0"/>
+        </w:rPr>
+      </w:r>
+      <w:r>
+        <w:t xml:space="preserve">4. </w:t>
+      </w:r>
+      <w:r>
+        <w:t>Silver Award, 15th Dandelion University Student Entrepreneurship Competition, Zhejiang University; 2023.</w:t>
+      </w:r>
+    </w:p>
+    <w:p>
+      <w:pPr>
+        <w:keepNext w:val="0"/>
+        <w:keepLines/>
+        <w:ind w:left="317" w:hanging="317"/>
+        <w:jc w:val="both"/>
+      </w:pPr>
+      <w:r>
+        <w:rPr>
+          <w:b w:val="0"/>
+        </w:rPr>
+      </w:r>
+      <w:r>
+        <w:t xml:space="preserve">5. </w:t>
+      </w:r>
+      <w:r>
+        <w:t>Honorable Mention, Mathematical Contest in Modeling / Interdisciplinary Contest in Modeling (MCM/ICM); 2022.</w:t>
+      </w:r>
+    </w:p>
+    <w:p>
+      <w:pPr>
+        <w:keepNext w:val="0"/>
+        <w:keepLines/>
+        <w:ind w:left="317" w:hanging="317"/>
+        <w:jc w:val="both"/>
+      </w:pPr>
+      <w:r>
+        <w:rPr>
+          <w:b w:val="0"/>
+        </w:rPr>
+      </w:r>
+      <w:r>
+        <w:t xml:space="preserve">6. </w:t>
+      </w:r>
+      <w:r>
+        <w:t>Second Prize, national final, 14th National University Student Social Practice and Science Contest on Energy Saving and Emission Reduction; 2021.</w:t>
+      </w:r>
+    </w:p>
+    <w:p>
+      <w:pPr>
+        <w:keepNext w:val="0"/>
+        <w:keepLines/>
+        <w:ind w:left="317" w:hanging="317"/>
+        <w:jc w:val="both"/>
+      </w:pPr>
+      <w:r>
+        <w:rPr>
+          <w:b w:val="0"/>
+        </w:rPr>
+      </w:r>
+      <w:r>
+        <w:t xml:space="preserve">7. </w:t>
+      </w:r>
+      <w:r>
+        <w:t>First Prize, Southern Region; Third Prize, National, 8th National Financial and Securities Investment Simulation Training Contest; 2021.</w:t>
+      </w:r>
+    </w:p>
+    <w:p>
+      <w:pPr>
+        <w:keepNext w:val="0"/>
+        <w:keepLines/>
+        <w:ind w:left="317" w:hanging="317"/>
+        <w:jc w:val="both"/>
+      </w:pPr>
+      <w:r>
+        <w:rPr>
+          <w:b w:val="0"/>
+        </w:rPr>
+      </w:r>
+      <w:r>
+        <w:t xml:space="preserve">8. </w:t>
+      </w:r>
+      <w:r>
+        <w:t>Grand Prize, 3rd National College Student Structural Design Information Technology Competition; 2021.</w:t>
+      </w:r>
+    </w:p>
+    <w:p>
+      <w:pPr>
+        <w:keepNext w:val="0"/>
+        <w:keepLines/>
+        <w:ind w:left="317" w:hanging="317"/>
+        <w:jc w:val="both"/>
+      </w:pPr>
+      <w:r>
+        <w:rPr>
+          <w:b w:val="0"/>
+        </w:rPr>
+      </w:r>
+      <w:r>
+        <w:t xml:space="preserve">9. </w:t>
+      </w:r>
+      <w:r>
+        <w:t>Third Prize, Hubei, 13th Challenge Cup National Undergraduate Curricular Academic Science and Technology Works Competition; 2021.</w:t>
+      </w:r>
+    </w:p>
+    <w:p>
+      <w:pPr>
+        <w:keepNext w:val="0"/>
+        <w:keepLines/>
+        <w:ind w:left="317" w:hanging="317"/>
+        <w:jc w:val="both"/>
+      </w:pPr>
+      <w:r>
+        <w:rPr>
+          <w:b w:val="0"/>
+        </w:rPr>
+      </w:r>
+      <w:r>
+        <w:t xml:space="preserve">10. </w:t>
+      </w:r>
+      <w:r>
+        <w:t>Honorable Mention, Mathematical Contest in Modeling / Interdisciplinary Contest in Modeling (MCM/ICM); 2021.</w:t>
+      </w:r>
+    </w:p>
+    <w:p>
+      <w:pPr>
+        <w:keepNext w:val="0"/>
+        <w:keepLines/>
+        <w:ind w:left="317" w:hanging="317"/>
+        <w:jc w:val="both"/>
+      </w:pPr>
+      <w:r>
+        <w:rPr>
+          <w:b w:val="0"/>
+        </w:rPr>
+      </w:r>
+      <w:r>
+        <w:t xml:space="preserve">11. </w:t>
+      </w:r>
+      <w:r>
+        <w:t>Second Prize, Hubei, Contemporary Undergraduate Mathematical Contest in Modeling; 2020.</w:t>
+      </w:r>
+    </w:p>
+    <w:p>
+      <w:pPr>
+        <w:keepNext w:val="0"/>
+        <w:keepLines/>
+        <w:ind w:left="317" w:hanging="317"/>
+        <w:jc w:val="both"/>
+      </w:pPr>
+      <w:r>
+        <w:rPr>
+          <w:b w:val="0"/>
+        </w:rPr>
+      </w:r>
+      <w:r>
+        <w:t xml:space="preserve">12. </w:t>
+      </w:r>
+      <w:r>
+        <w:t>Third Prize, Hubei, 5th National Construction College Construction Technology Application Skills Competition; 2020.</w:t>
+      </w:r>
+    </w:p>
+    <w:p>
+      <w:pPr>
+        <w:pStyle w:val="Heading1"/>
+        <w:pBdr>
+          <w:bottom w:val="single" w:sz="4" w:color="777777" w:space="3"/>
+        </w:pBdr>
+      </w:pPr>
+      <w:r>
+        <w:t>Additional experience</w:t>
+      </w:r>
+    </w:p>
+    <w:p>
+      <w:pPr>
+        <w:keepNext w:val="0"/>
+        <w:keepLines/>
+        <w:ind w:left="317" w:hanging="317"/>
+        <w:jc w:val="both"/>
+      </w:pPr>
+      <w:r>
+        <w:rPr>
+          <w:b w:val="0"/>
+        </w:rPr>
+      </w:r>
+      <w:r>
+        <w:t xml:space="preserve">1. </w:t>
+      </w:r>
+      <w:r>
+        <w:t>Government affairs intern, Science and Technology Exchange Division, China Centre for International Science and Technology Exchange, CAST. 2023.07–2023.09</w:t>
+      </w:r>
+    </w:p>
+    <w:p>
+      <w:pPr>
+        <w:keepNext w:val="0"/>
+        <w:keepLines/>
+        <w:ind w:left="317" w:hanging="317"/>
+        <w:jc w:val="both"/>
+      </w:pPr>
+      <w:r>
+        <w:rPr>
+          <w:b w:val="0"/>
+        </w:rPr>
+      </w:r>
+      <w:r>
+        <w:t xml:space="preserve">2. </w:t>
+      </w:r>
+      <w:r>
+        <w:t>Student fitness club coordinator, Ocean College, Zhejiang University; team champion in the university fitness and bodybuilding competition, 2023. 2022.06–2024.06</w:t>
+      </w:r>
+    </w:p>
+    <w:p>
+      <w:pPr>
+        <w:keepNext w:val="0"/>
+        <w:keepLines/>
+        <w:ind w:left="317" w:hanging="317"/>
+        <w:jc w:val="both"/>
+      </w:pPr>
+      <w:r>
+        <w:rPr>
+          <w:b w:val="0"/>
+        </w:rPr>
+      </w:r>
+      <w:r>
+        <w:t xml:space="preserve">3. </w:t>
+      </w:r>
+      <w:r>
+        <w:t>Author of the published poetry collection Suganniran. 2025</w:t>
+      </w:r>
+    </w:p>
+    <w:p>
+      <w:pPr>
+        <w:keepNext w:val="0"/>
+        <w:keepLines/>
+        <w:ind w:left="317" w:hanging="317"/>
+        <w:jc w:val="both"/>
+      </w:pPr>
+      <w:r>
+        <w:rPr>
+          <w:b w:val="0"/>
+        </w:rPr>
+      </w:r>
+      <w:r>
+        <w:t xml:space="preserve">4. </w:t>
+      </w:r>
+      <w:r>
+        <w:t>Volunteer teacher, summer education programme, Songbai, Shennongjia, Hubei. 2019.07–2019.08</w:t>
+      </w:r>
+    </w:p>
+    <w:p>
+      <w:pPr>
+        <w:keepNext w:val="0"/>
+        <w:keepLines/>
+        <w:ind w:left="317" w:hanging="317"/>
+        <w:jc w:val="both"/>
+      </w:pPr>
+      <w:r>
+        <w:rPr>
+          <w:b w:val="0"/>
+        </w:rPr>
+      </w:r>
+      <w:r>
+        <w:t xml:space="preserve">5. </w:t>
+      </w:r>
+      <w:r>
+        <w:t>Construction site intern, Yujing Tiandi project, Kunfa Construction Company. 2019.06–2019.07</w:t>
       </w:r>
     </w:p>
     <w:sectPr>
-      <w:footerReference w:type="default" r:id="rId39"/>
+      <w:footerReference w:type="default" r:id="rId47"/>
       <w:pgSz w:w="11909" w:h="16834"/>
       <w:pgMar w:top="835" w:right="979" w:bottom="835" w:left="979" w:header="403" w:footer="403" w:gutter="0"/>
       <w:cols w:space="720"/>

</xml_diff>

<commit_message>
Complete seven under-review manuscripts and sync downloadable CV
</commit_message>
<xml_diff>
--- a/assets/files/Tianlong_Wang_CV.docx
+++ b/assets/files/Tianlong_Wang_CV.docx
@@ -277,7 +277,7 @@
         <w:t xml:space="preserve">Research outputs: </w:t>
       </w:r>
       <w:r>
-        <w:t>19 published papers (18 journal articles and 1 conference paper); 5 manuscripts under review; 8 invention-patent records (3 grant publications and 5 application publications); 6 open-source research software projects.</w:t>
+        <w:t>19 published papers (18 journal articles and 1 conference paper); 7 manuscripts under review; 8 invention-patent records (3 grant publications and 5 application publications); 6 open-source research software projects.</w:t>
       </w:r>
     </w:p>
     <w:p>
@@ -648,7 +648,7 @@
         </w:pBdr>
       </w:pPr>
       <w:r>
-        <w:t>Manuscripts under review 5</w:t>
+        <w:t>Manuscripts under review 7</w:t>
       </w:r>
     </w:p>
     <w:p>
@@ -804,6 +804,68 @@
       </w:r>
       <w:r>
         <w:t>. Under review following revision.</w:t>
+      </w:r>
+    </w:p>
+    <w:p>
+      <w:pPr>
+        <w:keepNext w:val="0"/>
+        <w:keepLines/>
+        <w:ind w:left="317" w:hanging="317"/>
+        <w:jc w:val="both"/>
+      </w:pPr>
+      <w:r>
+        <w:t xml:space="preserve">6. Hao Yang, </w:t>
+      </w:r>
+      <w:r>
+        <w:rPr>
+          <w:b/>
+          <w:u w:val="single"/>
+        </w:rPr>
+        <w:t xml:space="preserve">Tianlong Wang</w:t>
+      </w:r>
+      <w:r>
+        <w:t xml:space="preserve">*, Haijun Qiu, Nikita Igorevich Fomin, Shuoting Xiao, Pengyue Zhao. An explainable and metaheuristic-optimized machine learning framework for spatial debris flow risk prediction: Application to the northern China-Pakistan Economic Corridor. </w:t>
+      </w:r>
+      <w:r>
+        <w:rPr>
+          <w:i/>
+          <w:color w:val="183F92"/>
+        </w:rPr>
+        <w:t xml:space="preserve">Stochastic Environmental Research and Risk Assessment</w:t>
+      </w:r>
+      <w:r>
+        <w:t xml:space="preserve">. Under review following second revision.</w:t>
+      </w:r>
+    </w:p>
+    <w:p>
+      <w:pPr>
+        <w:keepNext w:val="0"/>
+        <w:keepLines/>
+        <w:ind w:left="317" w:hanging="317"/>
+        <w:jc w:val="both"/>
+      </w:pPr>
+      <w:r>
+        <w:t xml:space="preserve">7. Yanhui Li, </w:t>
+      </w:r>
+      <w:r>
+        <w:rPr>
+          <w:b/>
+          <w:u w:val="single"/>
+        </w:rPr>
+        <w:t xml:space="preserve">Tianlong Wang</w:t>
+      </w:r>
+      <w:r>
+        <w:t xml:space="preserve">*, Xiaorui Tao. DynaStack: An explainable and robust ensemble framework for trend-based stock price prediction and strategy optimization. </w:t>
+      </w:r>
+      <w:r>
+        <w:rPr>
+          <w:i/>
+          <w:color w:val="183F92"/>
+        </w:rPr>
+        <w:t xml:space="preserve">Journal of Forecasting</w:t>
+      </w:r>
+      <w:r>
+        <w:t xml:space="preserve">. Under review following second revision.</w:t>
       </w:r>
     </w:p>
     <w:p>

</xml_diff>

<commit_message>
Limit CV publication lists to first and corresponding authorship
</commit_message>
<xml_diff>
--- a/assets/files/Tianlong_Wang_CV.docx
+++ b/assets/files/Tianlong_Wang_CV.docx
@@ -277,7 +277,7 @@
         <w:t xml:space="preserve">Research outputs: </w:t>
       </w:r>
       <w:r>
-        <w:t>19 published papers (18 journal articles and 1 conference paper); 7 manuscripts under review; 8 invention-patent records (3 grant publications and 5 application publications); 6 open-source research software projects.</w:t>
+        <w:t>13 first- or corresponding-author publications (12 journal articles and 1 conference paper); 7 manuscripts under review; 8 invention-patent records (3 grant publications and 5 application publications); 6 open-source research software projects.</w:t>
       </w:r>
     </w:p>
     <w:p>
@@ -876,7 +876,7 @@
         </w:pBdr>
       </w:pPr>
       <w:r>
-        <w:t>Published papers 19</w:t>
+        <w:t>Published papers (first or corresponding author) 13</w:t>
       </w:r>
     </w:p>
     <w:p>
@@ -991,7 +991,7 @@
         <w:jc w:val="both"/>
       </w:pPr>
       <w:r>
-        <w:t xml:space="preserve">3. K. Zhang, </w:t>
+        <w:t xml:space="preserve">3. H. Yang, </w:t>
       </w:r>
       <w:r>
         <w:rPr>
@@ -1001,23 +1001,23 @@
         <w:t>Tianlong Wang</w:t>
       </w:r>
       <w:r>
-        <w:t xml:space="preserve">, J. Su, H. Sun*. Impacts of Land Use Change on Watershed Hydrological Processes Based on the SWAT-ML-SHAP Model: A Case Study of Fenshuijiang River Basin. </w:t>
+        <w:t xml:space="preserve">*, N. I. Fomin, S. Xiao, L. Liu. An integrated IKOA-CNN-BiGRU-Attention framework with SHAP explainability for high-precision debris flow hazard prediction in the Nujiang river basin, China. </w:t>
       </w:r>
       <w:r>
         <w:rPr>
           <w:i/>
           <w:color w:val="183F92"/>
         </w:rPr>
-        <w:t>Earth Science</w:t>
-      </w:r>
-      <w:r>
-        <w:t xml:space="preserve">, 2026. </w:t>
+        <w:t>PLOS ONE, 20(6), e0326587</w:t>
+      </w:r>
+      <w:r>
+        <w:t xml:space="preserve">, 2025. </w:t>
       </w:r>
       <w:r>
         <w:fldChar w:fldCharType="begin"/>
       </w:r>
       <w:r>
-        <w:instrText xml:space="preserve"> HYPERLINK "https://doi.org/10.3799/dqkx.2025.290" \h </w:instrText>
+        <w:instrText xml:space="preserve"> HYPERLINK "https://doi.org/10.1371/journal.pone.0326587" \h </w:instrText>
       </w:r>
       <w:r>
         <w:fldChar w:fldCharType="separate"/>
@@ -1026,7 +1026,7 @@
         <w:rPr>
           <w:color w:val="183F92"/>
         </w:rPr>
-        <w:t>https://doi.org/10.3799/dqkx.2025.290</w:t>
+        <w:t>https://doi.org/10.1371/journal.pone.0326587</w:t>
       </w:r>
       <w:r>
         <w:rPr>
@@ -1043,7 +1043,7 @@
         <w:jc w:val="both"/>
       </w:pPr>
       <w:r>
-        <w:t xml:space="preserve">4. H. Yang, </w:t>
+        <w:t xml:space="preserve">4. </w:t>
       </w:r>
       <w:r>
         <w:rPr>
@@ -1053,14 +1053,14 @@
         <w:t>Tianlong Wang</w:t>
       </w:r>
       <w:r>
-        <w:t xml:space="preserve">*, N. I. Fomin, S. Xiao, L. Liu. An integrated IKOA-CNN-BiGRU-Attention framework with SHAP explainability for high-precision debris flow hazard prediction in the Nujiang river basin, China. </w:t>
+        <w:t xml:space="preserve">, Q. Ge, T. Ma, et al.. A novel method for predicting debris flow hazard: a multi-strategy fusion approach based on the light gradient boosting machine framework. </w:t>
       </w:r>
       <w:r>
         <w:rPr>
           <w:i/>
           <w:color w:val="183F92"/>
         </w:rPr>
-        <w:t>PLOS ONE, 20(6), e0326587</w:t>
+        <w:t>Stochastic Environmental Research and Risk Assessment, 39, 4867–4890</w:t>
       </w:r>
       <w:r>
         <w:t xml:space="preserve">, 2025. </w:t>
@@ -1069,7 +1069,7 @@
         <w:fldChar w:fldCharType="begin"/>
       </w:r>
       <w:r>
-        <w:instrText xml:space="preserve"> HYPERLINK "https://doi.org/10.1371/journal.pone.0326587" \h </w:instrText>
+        <w:instrText xml:space="preserve"> HYPERLINK "https://doi.org/10.1007/s00477-025-02955-9" \h </w:instrText>
       </w:r>
       <w:r>
         <w:fldChar w:fldCharType="separate"/>
@@ -1078,7 +1078,7 @@
         <w:rPr>
           <w:color w:val="183F92"/>
         </w:rPr>
-        <w:t>https://doi.org/10.1371/journal.pone.0326587</w:t>
+        <w:t>https://doi.org/10.1007/s00477-025-02955-9</w:t>
       </w:r>
       <w:r>
         <w:rPr>
@@ -1105,23 +1105,23 @@
         <w:t>Tianlong Wang</w:t>
       </w:r>
       <w:r>
-        <w:t xml:space="preserve">, Q. Ge, T. Ma, et al.. A novel method for predicting debris flow hazard: a multi-strategy fusion approach based on the light gradient boosting machine framework. </w:t>
+        <w:t xml:space="preserve">, K. Zhang, Z. Liu, T. Ma, R. Luo, H. Chen, X. Wang, W. Ge, H. Sun*. Prediction and explanation of debris flow velocity based on multi-strategy fusion Stacking ensemble learning model. </w:t>
       </w:r>
       <w:r>
         <w:rPr>
           <w:i/>
           <w:color w:val="183F92"/>
         </w:rPr>
-        <w:t>Stochastic Environmental Research and Risk Assessment, 39, 4867–4890</w:t>
-      </w:r>
-      <w:r>
-        <w:t xml:space="preserve">, 2025. </w:t>
+        <w:t>Journal of Hydrology, 638, 131347</w:t>
+      </w:r>
+      <w:r>
+        <w:t xml:space="preserve">, 2024. </w:t>
       </w:r>
       <w:r>
         <w:fldChar w:fldCharType="begin"/>
       </w:r>
       <w:r>
-        <w:instrText xml:space="preserve"> HYPERLINK "https://doi.org/10.1007/s00477-025-02955-9" \h </w:instrText>
+        <w:instrText xml:space="preserve"> HYPERLINK "https://doi.org/10.1016/j.jhydrol.2024.131347" \h </w:instrText>
       </w:r>
       <w:r>
         <w:fldChar w:fldCharType="separate"/>
@@ -1130,7 +1130,7 @@
         <w:rPr>
           <w:color w:val="183F92"/>
         </w:rPr>
-        <w:t>https://doi.org/10.1007/s00477-025-02955-9</w:t>
+        <w:t>https://doi.org/10.1016/j.jhydrol.2024.131347</w:t>
       </w:r>
       <w:r>
         <w:rPr>
@@ -1147,7 +1147,7 @@
         <w:jc w:val="both"/>
       </w:pPr>
       <w:r>
-        <w:t xml:space="preserve">6. X. Wang, Q. Ge, K. Zhang, </w:t>
+        <w:t xml:space="preserve">6. </w:t>
       </w:r>
       <w:r>
         <w:rPr>
@@ -1157,23 +1157,23 @@
         <w:t>Tianlong Wang</w:t>
       </w:r>
       <w:r>
-        <w:t xml:space="preserve">, T. Ma, H. Sun*. 3D Numerical Simulation of the Shortest Length of a Blocking Section for a Self-Starting Drainage Method. </w:t>
+        <w:t xml:space="preserve">, R. Luo, T. Ma, et al.. Study and verification on an improved comprehensive prediction model of landslide displacement. </w:t>
       </w:r>
       <w:r>
         <w:rPr>
           <w:i/>
           <w:color w:val="183F92"/>
         </w:rPr>
-        <w:t>International Journal of Geomechanics, 25(10), 04025209</w:t>
-      </w:r>
-      <w:r>
-        <w:t xml:space="preserve">, 2025. </w:t>
+        <w:t>Bulletin of Engineering Geology and the Environment, 83, Article 90</w:t>
+      </w:r>
+      <w:r>
+        <w:t xml:space="preserve">, 2024. </w:t>
       </w:r>
       <w:r>
         <w:fldChar w:fldCharType="begin"/>
       </w:r>
       <w:r>
-        <w:instrText xml:space="preserve"> HYPERLINK "https://doi.org/10.1061/IJGNAI.GMENG-10939" \h </w:instrText>
+        <w:instrText xml:space="preserve"> HYPERLINK "https://doi.org/10.1007/s10064-024-03581-5" \h </w:instrText>
       </w:r>
       <w:r>
         <w:fldChar w:fldCharType="separate"/>
@@ -1182,7 +1182,7 @@
         <w:rPr>
           <w:color w:val="183F92"/>
         </w:rPr>
-        <w:t>https://doi.org/10.1061/IJGNAI.GMENG-10939</w:t>
+        <w:t>https://doi.org/10.1007/s10064-024-03581-5</w:t>
       </w:r>
       <w:r>
         <w:rPr>
@@ -1199,7 +1199,7 @@
         <w:jc w:val="both"/>
       </w:pPr>
       <w:r>
-        <w:t xml:space="preserve">7. P. Lu, Y. Yu*, S. Liu, </w:t>
+        <w:t xml:space="preserve">7. Z. Chu, S. Yu, X. Li, X. Lu, X. Wang, R. Luo, </w:t>
       </w:r>
       <w:r>
         <w:rPr>
@@ -1209,23 +1209,23 @@
         <w:t>Tianlong Wang</w:t>
       </w:r>
       <w:r>
-        <w:t xml:space="preserve">, Z. Xu. Multi-parameter Calibration Method and Application of Constitutive Model Based on Improved Dung Beetle Optimization Algorithm. </w:t>
+        <w:t xml:space="preserve">*. Indoor Model Test of Negative Pressure Drainage Method for Treatment of Engineering Mud. </w:t>
       </w:r>
       <w:r>
         <w:rPr>
           <w:i/>
           <w:color w:val="183F92"/>
         </w:rPr>
-        <w:t>Journal of Disaster Prevention and Mitigation Engineering, 45(5), 1014–1023. (In Chinese)</w:t>
-      </w:r>
-      <w:r>
-        <w:t xml:space="preserve">, 2025. </w:t>
+        <w:t>Journal of Changjiang River Scientific Research Institute, 41(9), 114–122, 129. (In Chinese)</w:t>
+      </w:r>
+      <w:r>
+        <w:t xml:space="preserve">, 2024. </w:t>
       </w:r>
       <w:r>
         <w:fldChar w:fldCharType="begin"/>
       </w:r>
       <w:r>
-        <w:instrText xml:space="preserve"> HYPERLINK "https://doi.org/10.13409/j.cnki.jdpme.20250224001" \h </w:instrText>
+        <w:instrText xml:space="preserve"> HYPERLINK "https://doi.org/10.11988/ckyyb.20230665" \h </w:instrText>
       </w:r>
       <w:r>
         <w:fldChar w:fldCharType="separate"/>
@@ -1234,7 +1234,7 @@
         <w:rPr>
           <w:color w:val="183F92"/>
         </w:rPr>
-        <w:t>https://doi.org/10.13409/j.cnki.jdpme.20250224001</w:t>
+        <w:t>https://doi.org/10.11988/ckyyb.20230665</w:t>
       </w:r>
       <w:r>
         <w:rPr>
@@ -1261,14 +1261,14 @@
         <w:t>Tianlong Wang</w:t>
       </w:r>
       <w:r>
-        <w:t xml:space="preserve">, K. Zhang, Z. Liu, T. Ma, R. Luo, H. Chen, X. Wang, W. Ge, H. Sun*. Prediction and explanation of debris flow velocity based on multi-strategy fusion Stacking ensemble learning model. </w:t>
+        <w:t xml:space="preserve">, D. Peng, X. Wang, B. Wu, R. Luo, Z. Chu, H. Sun*. Study on wavelet multi-scale analysis and prediction of landslide groundwater. </w:t>
       </w:r>
       <w:r>
         <w:rPr>
           <w:i/>
           <w:color w:val="183F92"/>
         </w:rPr>
-        <w:t>Journal of Hydrology, 638, 131347</w:t>
+        <w:t>Journal of Hydroinformatics, 26(1), 237–254</w:t>
       </w:r>
       <w:r>
         <w:t xml:space="preserve">, 2024. </w:t>
@@ -1277,7 +1277,7 @@
         <w:fldChar w:fldCharType="begin"/>
       </w:r>
       <w:r>
-        <w:instrText xml:space="preserve"> HYPERLINK "https://doi.org/10.1016/j.jhydrol.2024.131347" \h </w:instrText>
+        <w:instrText xml:space="preserve"> HYPERLINK "https://doi.org/10.2166/hydro.2023.299" \h </w:instrText>
       </w:r>
       <w:r>
         <w:fldChar w:fldCharType="separate"/>
@@ -1286,7 +1286,7 @@
         <w:rPr>
           <w:color w:val="183F92"/>
         </w:rPr>
-        <w:t>https://doi.org/10.1016/j.jhydrol.2024.131347</w:t>
+        <w:t>https://doi.org/10.2166/hydro.2023.299</w:t>
       </w:r>
       <w:r>
         <w:rPr>
@@ -1313,23 +1313,23 @@
         <w:t>Tianlong Wang</w:t>
       </w:r>
       <w:r>
-        <w:t xml:space="preserve">, R. Luo, T. Ma, et al.. Study and verification on an improved comprehensive prediction model of landslide displacement. </w:t>
+        <w:t xml:space="preserve">, Xiaorui Tao, Dong-kun Wu, Haotian Feng. Determining the location of River Dam Group based on set cover Model: A case study of Zambezi River Basin. </w:t>
       </w:r>
       <w:r>
         <w:rPr>
           <w:i/>
           <w:color w:val="183F92"/>
         </w:rPr>
-        <w:t>Bulletin of Engineering Geology and the Environment, 83, Article 90</w:t>
-      </w:r>
-      <w:r>
-        <w:t xml:space="preserve">, 2024. </w:t>
+        <w:t>Scientific Research and Reviews, 14, 122</w:t>
+      </w:r>
+      <w:r>
+        <w:t xml:space="preserve">, 2021. </w:t>
       </w:r>
       <w:r>
         <w:fldChar w:fldCharType="begin"/>
       </w:r>
       <w:r>
-        <w:instrText xml:space="preserve"> HYPERLINK "https://doi.org/10.1007/s10064-024-03581-5" \h </w:instrText>
+        <w:instrText xml:space="preserve"> HYPERLINK "https://doi.org/10.28933/srr-2021-03-1005" \h </w:instrText>
       </w:r>
       <w:r>
         <w:fldChar w:fldCharType="separate"/>
@@ -1338,7 +1338,7 @@
         <w:rPr>
           <w:color w:val="183F92"/>
         </w:rPr>
-        <w:t>https://doi.org/10.1007/s10064-024-03581-5</w:t>
+        <w:t>https://doi.org/10.28933/srr-2021-03-1005</w:t>
       </w:r>
       <w:r>
         <w:rPr>
@@ -1355,7 +1355,7 @@
         <w:jc w:val="both"/>
       </w:pPr>
       <w:r>
-        <w:t xml:space="preserve">10. Z. Chu, S. Yu, X. Li, X. Lu, X. Wang, R. Luo, </w:t>
+        <w:t xml:space="preserve">10. </w:t>
       </w:r>
       <w:r>
         <w:rPr>
@@ -1365,23 +1365,23 @@
         <w:t>Tianlong Wang</w:t>
       </w:r>
       <w:r>
-        <w:t xml:space="preserve">*. Indoor Model Test of Negative Pressure Drainage Method for Treatment of Engineering Mud. </w:t>
+        <w:t xml:space="preserve">, J. Wang, X. Shao. Carbon emission forecast of China Transport Industry Based on Grey - Markov. </w:t>
       </w:r>
       <w:r>
         <w:rPr>
           <w:i/>
           <w:color w:val="183F92"/>
         </w:rPr>
-        <w:t>Journal of Changjiang River Scientific Research Institute, 41(9), 114–122, 129. (In Chinese)</w:t>
-      </w:r>
-      <w:r>
-        <w:t xml:space="preserve">, 2024. </w:t>
+        <w:t>International Conference on Computing and Big Data (ICCBD)</w:t>
+      </w:r>
+      <w:r>
+        <w:t xml:space="preserve">, 2021. </w:t>
       </w:r>
       <w:r>
         <w:fldChar w:fldCharType="begin"/>
       </w:r>
       <w:r>
-        <w:instrText xml:space="preserve"> HYPERLINK "https://doi.org/10.11988/ckyyb.20230665" \h </w:instrText>
+        <w:instrText xml:space="preserve"> HYPERLINK "https://doi.org/10.1109/ICCBD53833.2021.00192" \h </w:instrText>
       </w:r>
       <w:r>
         <w:fldChar w:fldCharType="separate"/>
@@ -1390,7 +1390,7 @@
         <w:rPr>
           <w:color w:val="183F92"/>
         </w:rPr>
-        <w:t>https://doi.org/10.11988/ckyyb.20230665</w:t>
+        <w:t>https://doi.org/10.1109/ICCBD53833.2021.00192</w:t>
       </w:r>
       <w:r>
         <w:rPr>
@@ -1417,23 +1417,23 @@
         <w:t>Tianlong Wang</w:t>
       </w:r>
       <w:r>
-        <w:t xml:space="preserve">, D. Peng, X. Wang, B. Wu, R. Luo, Z. Chu, H. Sun*. Study on wavelet multi-scale analysis and prediction of landslide groundwater. </w:t>
+        <w:t xml:space="preserve">, H. Zhang, X. Tao, W. Chu. Research on Prediction and Optimization of Slope Deformation in Mining Area. </w:t>
       </w:r>
       <w:r>
         <w:rPr>
           <w:i/>
           <w:color w:val="183F92"/>
         </w:rPr>
-        <w:t>Journal of Hydroinformatics, 26(1), 237–254</w:t>
-      </w:r>
-      <w:r>
-        <w:t xml:space="preserve">, 2024. </w:t>
+        <w:t>Environment, Resource and Ecology Journal, 4, 66–69</w:t>
+      </w:r>
+      <w:r>
+        <w:t xml:space="preserve">, 2020. </w:t>
       </w:r>
       <w:r>
         <w:fldChar w:fldCharType="begin"/>
       </w:r>
       <w:r>
-        <w:instrText xml:space="preserve"> HYPERLINK "https://doi.org/10.2166/hydro.2023.299" \h </w:instrText>
+        <w:instrText xml:space="preserve"> HYPERLINK "https://doi.org/10.23977/erej.2020.040110" \h </w:instrText>
       </w:r>
       <w:r>
         <w:fldChar w:fldCharType="separate"/>
@@ -1442,7 +1442,7 @@
         <w:rPr>
           <w:color w:val="183F92"/>
         </w:rPr>
-        <w:t>https://doi.org/10.2166/hydro.2023.299</w:t>
+        <w:t>https://doi.org/10.23977/erej.2020.040110</w:t>
       </w:r>
       <w:r>
         <w:rPr>
@@ -1459,7 +1459,7 @@
         <w:jc w:val="both"/>
       </w:pPr>
       <w:r>
-        <w:t xml:space="preserve">12. H. Sun, X. Wang, Y. Yu*, J. Shu, </w:t>
+        <w:t xml:space="preserve">12. </w:t>
       </w:r>
       <w:r>
         <w:rPr>
@@ -1469,318 +1469,6 @@
         <w:t>Tianlong Wang</w:t>
       </w:r>
       <w:r>
-        <w:t xml:space="preserve">, R. Luo, Z. Chu. A new anchor-siphon drainage combined method used for slope stabilization. </w:t>
-      </w:r>
-      <w:r>
-        <w:rPr>
-          <w:i/>
-          <w:color w:val="183F92"/>
-        </w:rPr>
-        <w:t>Journal of Mountain Science, 20(11), 3295–3311</w:t>
-      </w:r>
-      <w:r>
-        <w:t xml:space="preserve">, 2023. </w:t>
-      </w:r>
-      <w:r>
-        <w:fldChar w:fldCharType="begin"/>
-      </w:r>
-      <w:r>
-        <w:instrText xml:space="preserve"> HYPERLINK "https://doi.org/10.1007/s11629-023-7969-x" \h </w:instrText>
-      </w:r>
-      <w:r>
-        <w:fldChar w:fldCharType="separate"/>
-      </w:r>
-      <w:r>
-        <w:rPr>
-          <w:color w:val="183F92"/>
-        </w:rPr>
-        <w:t>https://doi.org/10.1007/s11629-023-7969-x</w:t>
-      </w:r>
-      <w:r>
-        <w:rPr>
-          <w:color w:val="183F92"/>
-        </w:rPr>
-        <w:fldChar w:fldCharType="end"/>
-      </w:r>
-    </w:p>
-    <w:p>
-      <w:pPr>
-        <w:keepNext w:val="0"/>
-        <w:keepLines/>
-        <w:ind w:left="317" w:hanging="317"/>
-        <w:jc w:val="both"/>
-      </w:pPr>
-      <w:r>
-        <w:t xml:space="preserve">13. Zheng Li, Jie Liu*, Qian Shi, Kun Mao, Zhao Li, Hongyu Tang, </w:t>
-      </w:r>
-      <w:r>
-        <w:rPr>
-          <w:b/>
-          <w:u w:val="single"/>
-        </w:rPr>
-        <w:t>Tianlong Wang</w:t>
-      </w:r>
-      <w:r>
-        <w:t xml:space="preserve">. Experimental Study on Grouting and Flow Characteristics of Rough Vertical Fractures. </w:t>
-      </w:r>
-      <w:r>
-        <w:rPr>
-          <w:i/>
-          <w:color w:val="183F92"/>
-        </w:rPr>
-        <w:t>Geofluids, 2022, Article 3165524, 15 pages</w:t>
-      </w:r>
-      <w:r>
-        <w:t xml:space="preserve">, 2022. </w:t>
-      </w:r>
-      <w:r>
-        <w:fldChar w:fldCharType="begin"/>
-      </w:r>
-      <w:r>
-        <w:instrText xml:space="preserve"> HYPERLINK "https://doi.org/10.1155/2022/3165524" \h </w:instrText>
-      </w:r>
-      <w:r>
-        <w:fldChar w:fldCharType="separate"/>
-      </w:r>
-      <w:r>
-        <w:rPr>
-          <w:color w:val="183F92"/>
-        </w:rPr>
-        <w:t>https://doi.org/10.1155/2022/3165524</w:t>
-      </w:r>
-      <w:r>
-        <w:rPr>
-          <w:color w:val="183F92"/>
-        </w:rPr>
-        <w:fldChar w:fldCharType="end"/>
-      </w:r>
-    </w:p>
-    <w:p>
-      <w:pPr>
-        <w:keepNext w:val="0"/>
-        <w:keepLines/>
-        <w:ind w:left="317" w:hanging="317"/>
-        <w:jc w:val="both"/>
-      </w:pPr>
-      <w:r>
-        <w:t xml:space="preserve">14. X. Xu, X. Lei, </w:t>
-      </w:r>
-      <w:r>
-        <w:rPr>
-          <w:b/>
-          <w:u w:val="single"/>
-        </w:rPr>
-        <w:t>Tianlong Wang</w:t>
-      </w:r>
-      <w:r>
-        <w:t xml:space="preserve">, G. Kong*, C. Li. Experimental Research on Shear Mechanical Characteristics of Pile-Coral Sand Interface. </w:t>
-      </w:r>
-      <w:r>
-        <w:rPr>
-          <w:i/>
-          <w:color w:val="183F92"/>
-        </w:rPr>
-        <w:t>Chinese Journal of Underground Space and Engineering, 18(6), 1891–1897. (In Chinese)</w:t>
-      </w:r>
-      <w:r>
-        <w:t xml:space="preserve">, 2022. </w:t>
-      </w:r>
-      <w:r>
-        <w:fldChar w:fldCharType="begin"/>
-      </w:r>
-      <w:r>
-        <w:instrText xml:space="preserve"> HYPERLINK "https://doi.org/10.20174/j.juse.2022.06.016" \h </w:instrText>
-      </w:r>
-      <w:r>
-        <w:fldChar w:fldCharType="separate"/>
-      </w:r>
-      <w:r>
-        <w:rPr>
-          <w:color w:val="183F92"/>
-        </w:rPr>
-        <w:t>https://doi.org/10.20174/j.juse.2022.06.016</w:t>
-      </w:r>
-      <w:r>
-        <w:rPr>
-          <w:color w:val="183F92"/>
-        </w:rPr>
-        <w:fldChar w:fldCharType="end"/>
-      </w:r>
-    </w:p>
-    <w:p>
-      <w:pPr>
-        <w:keepNext w:val="0"/>
-        <w:keepLines/>
-        <w:ind w:left="317" w:hanging="317"/>
-        <w:jc w:val="both"/>
-      </w:pPr>
-      <w:r>
-        <w:t xml:space="preserve">15. </w:t>
-      </w:r>
-      <w:r>
-        <w:rPr>
-          <w:b/>
-          <w:u w:val="single"/>
-        </w:rPr>
-        <w:t>Tianlong Wang</w:t>
-      </w:r>
-      <w:r>
-        <w:t xml:space="preserve">, Xiaorui Tao, Dong-kun Wu, Haotian Feng. Determining the location of River Dam Group based on set cover Model: A case study of Zambezi River Basin. </w:t>
-      </w:r>
-      <w:r>
-        <w:rPr>
-          <w:i/>
-          <w:color w:val="183F92"/>
-        </w:rPr>
-        <w:t>Scientific Research and Reviews, 14, 122</w:t>
-      </w:r>
-      <w:r>
-        <w:t xml:space="preserve">, 2021. </w:t>
-      </w:r>
-      <w:r>
-        <w:fldChar w:fldCharType="begin"/>
-      </w:r>
-      <w:r>
-        <w:instrText xml:space="preserve"> HYPERLINK "https://doi.org/10.28933/srr-2021-03-1005" \h </w:instrText>
-      </w:r>
-      <w:r>
-        <w:fldChar w:fldCharType="separate"/>
-      </w:r>
-      <w:r>
-        <w:rPr>
-          <w:color w:val="183F92"/>
-        </w:rPr>
-        <w:t>https://doi.org/10.28933/srr-2021-03-1005</w:t>
-      </w:r>
-      <w:r>
-        <w:rPr>
-          <w:color w:val="183F92"/>
-        </w:rPr>
-        <w:fldChar w:fldCharType="end"/>
-      </w:r>
-    </w:p>
-    <w:p>
-      <w:pPr>
-        <w:keepNext w:val="0"/>
-        <w:keepLines/>
-        <w:ind w:left="317" w:hanging="317"/>
-        <w:jc w:val="both"/>
-      </w:pPr>
-      <w:r>
-        <w:t xml:space="preserve">16. </w:t>
-      </w:r>
-      <w:r>
-        <w:rPr>
-          <w:b/>
-          <w:u w:val="single"/>
-        </w:rPr>
-        <w:t>Tianlong Wang</w:t>
-      </w:r>
-      <w:r>
-        <w:t xml:space="preserve">, J. Wang, X. Shao. Carbon emission forecast of China Transport Industry Based on Grey - Markov. </w:t>
-      </w:r>
-      <w:r>
-        <w:rPr>
-          <w:i/>
-          <w:color w:val="183F92"/>
-        </w:rPr>
-        <w:t>International Conference on Computing and Big Data (ICCBD)</w:t>
-      </w:r>
-      <w:r>
-        <w:t xml:space="preserve">, 2021. </w:t>
-      </w:r>
-      <w:r>
-        <w:fldChar w:fldCharType="begin"/>
-      </w:r>
-      <w:r>
-        <w:instrText xml:space="preserve"> HYPERLINK "https://doi.org/10.1109/ICCBD53833.2021.00192" \h </w:instrText>
-      </w:r>
-      <w:r>
-        <w:fldChar w:fldCharType="separate"/>
-      </w:r>
-      <w:r>
-        <w:rPr>
-          <w:color w:val="183F92"/>
-        </w:rPr>
-        <w:t>https://doi.org/10.1109/ICCBD53833.2021.00192</w:t>
-      </w:r>
-      <w:r>
-        <w:rPr>
-          <w:color w:val="183F92"/>
-        </w:rPr>
-        <w:fldChar w:fldCharType="end"/>
-      </w:r>
-    </w:p>
-    <w:p>
-      <w:pPr>
-        <w:keepNext w:val="0"/>
-        <w:keepLines/>
-        <w:ind w:left="317" w:hanging="317"/>
-        <w:jc w:val="both"/>
-      </w:pPr>
-      <w:r>
-        <w:t xml:space="preserve">17. </w:t>
-      </w:r>
-      <w:r>
-        <w:rPr>
-          <w:b/>
-          <w:u w:val="single"/>
-        </w:rPr>
-        <w:t>Tianlong Wang</w:t>
-      </w:r>
-      <w:r>
-        <w:t xml:space="preserve">, H. Zhang, X. Tao, W. Chu. Research on Prediction and Optimization of Slope Deformation in Mining Area. </w:t>
-      </w:r>
-      <w:r>
-        <w:rPr>
-          <w:i/>
-          <w:color w:val="183F92"/>
-        </w:rPr>
-        <w:t>Environment, Resource and Ecology Journal, 4, 66–69</w:t>
-      </w:r>
-      <w:r>
-        <w:t xml:space="preserve">, 2020. </w:t>
-      </w:r>
-      <w:r>
-        <w:fldChar w:fldCharType="begin"/>
-      </w:r>
-      <w:r>
-        <w:instrText xml:space="preserve"> HYPERLINK "https://doi.org/10.23977/erej.2020.040110" \h </w:instrText>
-      </w:r>
-      <w:r>
-        <w:fldChar w:fldCharType="separate"/>
-      </w:r>
-      <w:r>
-        <w:rPr>
-          <w:color w:val="183F92"/>
-        </w:rPr>
-        <w:t>https://doi.org/10.23977/erej.2020.040110</w:t>
-      </w:r>
-      <w:r>
-        <w:rPr>
-          <w:color w:val="183F92"/>
-        </w:rPr>
-        <w:fldChar w:fldCharType="end"/>
-      </w:r>
-    </w:p>
-    <w:p>
-      <w:pPr>
-        <w:keepNext w:val="0"/>
-        <w:keepLines/>
-        <w:ind w:left="317" w:hanging="317"/>
-        <w:jc w:val="both"/>
-      </w:pPr>
-      <w:r>
-        <w:t xml:space="preserve">18. </w:t>
-      </w:r>
-      <w:r>
-        <w:rPr>
-          <w:b/>
-          <w:u w:val="single"/>
-        </w:rPr>
-        <w:t>Tianlong Wang</w:t>
-      </w:r>
-      <w:r>
         <w:t xml:space="preserve">, Hongyan Bao, Hairui Zhang. Optimization of Task Pricing Based on Multiple Regression Analysis and Game Theory. </w:t>
       </w:r>
       <w:r>
@@ -1823,7 +1511,7 @@
         <w:jc w:val="both"/>
       </w:pPr>
       <w:r>
-        <w:t xml:space="preserve">19. </w:t>
+        <w:t xml:space="preserve">13. </w:t>
       </w:r>
       <w:r>
         <w:rPr>

</xml_diff>

<commit_message>
Record BWSD acceptance and update academic website and CV downloads
</commit_message>
<xml_diff>
--- a/assets/files/Tianlong_Wang_CV.docx
+++ b/assets/files/Tianlong_Wang_CV.docx
@@ -277,7 +277,7 @@
         <w:t xml:space="preserve">Research outputs: </w:t>
       </w:r>
       <w:r>
-        <w:t>13 first- or corresponding-author publications (12 journal articles and 1 conference paper); 7 manuscripts under review; 8 invention-patent records (3 grant publications and 5 application publications); 6 open-source research software projects.</w:t>
+        <w:t>13 first- or corresponding-author publications (12 journal articles and 1 conference paper); 1 accepted article; 6 manuscripts under review; 8 invention-patent records (3 grant publications and 5 application publications); 6 open-source research software projects.</w:t>
       </w:r>
     </w:p>
     <w:p>
@@ -648,7 +648,7 @@
         </w:pBdr>
       </w:pPr>
       <w:r>
-        <w:t>Manuscripts under review 7</w:t>
+        <w:t>Manuscripts under review 6</w:t>
       </w:r>
     </w:p>
     <w:p>
@@ -700,6 +700,172 @@
         <w:t>Tianlong Wang</w:t>
       </w:r>
       <w:r>
+        <w:t xml:space="preserve">, Jian Chu, Jingkun Su, Runting Fan, Hao Yang, Hongyue Sun*. Hydrological readiness forecasting for debris flow early warning in a mountain catchment with sparse event records. </w:t>
+      </w:r>
+      <w:r>
+        <w:rPr>
+          <w:i/>
+          <w:color w:val="183F92"/>
+        </w:rPr>
+        <w:t>Bulletin of Engineering Geology and the Environment</w:t>
+      </w:r>
+      <w:r>
+        <w:t>. Under review.</w:t>
+      </w:r>
+    </w:p>
+    <w:p>
+      <w:pPr>
+        <w:keepNext w:val="0"/>
+        <w:keepLines/>
+        <w:ind w:left="317" w:hanging="317"/>
+        <w:jc w:val="both"/>
+      </w:pPr>
+      <w:r>
+        <w:t xml:space="preserve">3. </w:t>
+      </w:r>
+      <w:r>
+        <w:rPr>
+          <w:b/>
+          <w:u w:val="single"/>
+        </w:rPr>
+        <w:t>Tianlong Wang</w:t>
+      </w:r>
+      <w:r>
+        <w:t xml:space="preserve">, Jian Chu, Hao Yang, Hongyue Sun*. Robust state estimation and hydrology-informed residual learning for landslide velocity forecasting with prequential prediction intervals. </w:t>
+      </w:r>
+      <w:r>
+        <w:rPr>
+          <w:i/>
+          <w:color w:val="183F92"/>
+        </w:rPr>
+        <w:t>Georisk: Assessment and Management of Risk for Engineered Systems and Geohazards</w:t>
+      </w:r>
+      <w:r>
+        <w:t>. Under review.</w:t>
+      </w:r>
+    </w:p>
+    <w:p>
+      <w:pPr>
+        <w:keepNext w:val="0"/>
+        <w:keepLines/>
+        <w:ind w:left="317" w:hanging="317"/>
+        <w:jc w:val="both"/>
+      </w:pPr>
+      <w:r>
+        <w:t xml:space="preserve">4. </w:t>
+      </w:r>
+      <w:r>
+        <w:rPr>
+          <w:b/>
+          <w:u w:val="single"/>
+        </w:rPr>
+        <w:t>Tianlong Wang</w:t>
+      </w:r>
+      <w:r>
+        <w:t xml:space="preserve">, Jian Chu, Yanhui Li, Hao Yang, Hongyue Sun*. Sediment-source information improves small-sample prediction of maximum recorded debris-flow volume with a pretrained tabular model. </w:t>
+      </w:r>
+      <w:r>
+        <w:rPr>
+          <w:i/>
+          <w:color w:val="183F92"/>
+        </w:rPr>
+        <w:t>Stochastic Environmental Research and Risk Assessment</w:t>
+      </w:r>
+      <w:r>
+        <w:t>. Under review following revision.</w:t>
+      </w:r>
+    </w:p>
+    <w:p>
+      <w:pPr>
+        <w:keepNext w:val="0"/>
+        <w:keepLines/>
+        <w:ind w:left="317" w:hanging="317"/>
+        <w:jc w:val="both"/>
+      </w:pPr>
+      <w:r>
+        <w:t xml:space="preserve">5. Hao Yang, </w:t>
+      </w:r>
+      <w:r>
+        <w:rPr>
+          <w:b/>
+          <w:u w:val="single"/>
+        </w:rPr>
+        <w:t xml:space="preserve">Tianlong Wang</w:t>
+      </w:r>
+      <w:r>
+        <w:t xml:space="preserve">*, Haijun Qiu, Nikita Igorevich Fomin, Shuoting Xiao, Pengyue Zhao. An explainable and metaheuristic-optimized machine learning framework for spatial debris flow risk prediction: Application to the northern China-Pakistan Economic Corridor. </w:t>
+      </w:r>
+      <w:r>
+        <w:rPr>
+          <w:i/>
+          <w:color w:val="183F92"/>
+        </w:rPr>
+        <w:t xml:space="preserve">Stochastic Environmental Research and Risk Assessment</w:t>
+      </w:r>
+      <w:r>
+        <w:t xml:space="preserve">. Under review following second revision.</w:t>
+      </w:r>
+    </w:p>
+    <w:p>
+      <w:pPr>
+        <w:keepNext w:val="0"/>
+        <w:keepLines/>
+        <w:ind w:left="317" w:hanging="317"/>
+        <w:jc w:val="both"/>
+      </w:pPr>
+      <w:r>
+        <w:t xml:space="preserve">6. Yanhui Li, </w:t>
+      </w:r>
+      <w:r>
+        <w:rPr>
+          <w:b/>
+          <w:u w:val="single"/>
+        </w:rPr>
+        <w:t xml:space="preserve">Tianlong Wang</w:t>
+      </w:r>
+      <w:r>
+        <w:t xml:space="preserve">*, Xiaorui Tao. DynaStack: An explainable and robust ensemble framework for trend-based stock price prediction and strategy optimization. </w:t>
+      </w:r>
+      <w:r>
+        <w:rPr>
+          <w:i/>
+          <w:color w:val="183F92"/>
+        </w:rPr>
+        <w:t xml:space="preserve">Journal of Forecasting</w:t>
+      </w:r>
+      <w:r>
+        <w:t xml:space="preserve">. Under review following second revision.</w:t>
+      </w:r>
+    </w:p>
+    <w:p>
+      <w:pPr>
+        <w:pStyle w:val="3"/>
+        <w:pBdr>
+          <w:bottom w:val="single" w:color="777777" w:sz="4" w:space="3"/>
+        </w:pBdr>
+      </w:pPr>
+      <w:r>
+        <w:t>Published and accepted papers (first or corresponding author) 14</w:t>
+      </w:r>
+    </w:p>
+    <w:p>
+      <w:pPr>
+        <w:keepNext w:val="0"/>
+        <w:keepLines/>
+        <w:ind w:left="317" w:hanging="317"/>
+        <w:jc w:val="both"/>
+      </w:pPr>
+      <w:r>
+        <w:t xml:space="preserve">1. </w:t>
+      </w:r>
+      <w:r>
+        <w:rPr>
+          <w:b/>
+          <w:u w:val="single"/>
+        </w:rPr>
+        <w:t>Tianlong Wang</w:t>
+      </w:r>
+      <w:r>
         <w:t xml:space="preserve">, Jian Chu, Hao Yang, Hongyue Sun*. Basin Water Storage Degree for Risk-Informed Debris-Flow Warning Support: A Forward-Looking Proof of Concept in a Small Mountain Catchment. </w:t>
       </w:r>
       <w:r>
@@ -710,7 +876,7 @@
         <w:t>International Journal of Disaster Risk Reduction</w:t>
       </w:r>
       <w:r>
-        <w:t>. Under review following revision.</w:t>
+        <w:t>. Accepted 9 October 2026; in production.</w:t>
       </w:r>
     </w:p>
     <w:p>
@@ -721,7 +887,7 @@
         <w:jc w:val="both"/>
       </w:pPr>
       <w:r>
-        <w:t xml:space="preserve">3. </w:t>
+        <w:t xml:space="preserve">2. </w:t>
       </w:r>
       <w:r>
         <w:rPr>
@@ -731,17 +897,38 @@
         <w:t>Tianlong Wang</w:t>
       </w:r>
       <w:r>
-        <w:t xml:space="preserve">, Jian Chu, Jingkun Su, Runting Fan, Hao Yang, Hongyue Sun*. Hydrological readiness forecasting for debris flow early warning in a mountain catchment with sparse event records. </w:t>
+        <w:t xml:space="preserve">*, H. Yang. DOME: A Dynamic Optimization Meta-Ensemble Framework for Debris-Flow Susceptibility Assessment with SHAP-Based Interpretation. </w:t>
       </w:r>
       <w:r>
         <w:rPr>
           <w:i/>
           <w:color w:val="183F92"/>
         </w:rPr>
-        <w:t>Bulletin of Engineering Geology and the Environment</w:t>
-      </w:r>
-      <w:r>
-        <w:t>. Under review.</w:t>
+        <w:t>Natural Hazards, 122, Article 545</w:t>
+      </w:r>
+      <w:r>
+        <w:t xml:space="preserve">, 2026. </w:t>
+      </w:r>
+      <w:r>
+        <w:fldChar w:fldCharType="begin"/>
+      </w:r>
+      <w:r>
+        <w:instrText xml:space="preserve"> HYPERLINK "https://doi.org/10.1007/s11069-026-08307-2" \h </w:instrText>
+      </w:r>
+      <w:r>
+        <w:fldChar w:fldCharType="separate"/>
+      </w:r>
+      <w:r>
+        <w:rPr>
+          <w:color w:val="183F92"/>
+        </w:rPr>
+        <w:t>https://doi.org/10.1007/s11069-026-08307-2</w:t>
+      </w:r>
+      <w:r>
+        <w:rPr>
+          <w:color w:val="183F92"/>
+        </w:rPr>
+        <w:fldChar w:fldCharType="end"/>
       </w:r>
     </w:p>
     <w:p>
@@ -752,7 +939,7 @@
         <w:jc w:val="both"/>
       </w:pPr>
       <w:r>
-        <w:t xml:space="preserve">4. </w:t>
+        <w:t xml:space="preserve">3. </w:t>
       </w:r>
       <w:r>
         <w:rPr>
@@ -762,17 +949,38 @@
         <w:t>Tianlong Wang</w:t>
       </w:r>
       <w:r>
-        <w:t xml:space="preserve">, Jian Chu, Hao Yang, Hongyue Sun*. Robust state estimation and hydrology-informed residual learning for landslide velocity forecasting with prequential prediction intervals. </w:t>
+        <w:t xml:space="preserve">, H. Yang, H. Sun*. Intelligent Prediction of Post-Seismic Debris Flow Source Volumes: A Physics-Informed Generative Deep Learning Framework. </w:t>
       </w:r>
       <w:r>
         <w:rPr>
           <w:i/>
           <w:color w:val="183F92"/>
         </w:rPr>
-        <w:t>Georisk: Assessment and Management of Risk for Engineered Systems and Geohazards</w:t>
-      </w:r>
-      <w:r>
-        <w:t>. Under review.</w:t>
+        <w:t>Georisk: Assessment and Management of Risk for Engineered Systems and Geohazards, 1–29</w:t>
+      </w:r>
+      <w:r>
+        <w:t xml:space="preserve">, 2026. </w:t>
+      </w:r>
+      <w:r>
+        <w:fldChar w:fldCharType="begin"/>
+      </w:r>
+      <w:r>
+        <w:instrText xml:space="preserve"> HYPERLINK "https://doi.org/10.1080/17499518.2026.2651228" \h </w:instrText>
+      </w:r>
+      <w:r>
+        <w:fldChar w:fldCharType="separate"/>
+      </w:r>
+      <w:r>
+        <w:rPr>
+          <w:color w:val="183F92"/>
+        </w:rPr>
+        <w:t>https://doi.org/10.1080/17499518.2026.2651228</w:t>
+      </w:r>
+      <w:r>
+        <w:rPr>
+          <w:color w:val="183F92"/>
+        </w:rPr>
+        <w:fldChar w:fldCharType="end"/>
       </w:r>
     </w:p>
     <w:p>
@@ -783,7 +991,7 @@
         <w:jc w:val="both"/>
       </w:pPr>
       <w:r>
-        <w:t xml:space="preserve">5. </w:t>
+        <w:t xml:space="preserve">4. H. Yang, </w:t>
       </w:r>
       <w:r>
         <w:rPr>
@@ -793,17 +1001,38 @@
         <w:t>Tianlong Wang</w:t>
       </w:r>
       <w:r>
-        <w:t xml:space="preserve">, Jian Chu, Yanhui Li, Hao Yang, Hongyue Sun*. Sediment-source information improves small-sample prediction of maximum recorded debris-flow volume with a pretrained tabular model. </w:t>
+        <w:t xml:space="preserve">*, N. I. Fomin, S. Xiao, L. Liu. An integrated IKOA-CNN-BiGRU-Attention framework with SHAP explainability for high-precision debris flow hazard prediction in the Nujiang river basin, China. </w:t>
       </w:r>
       <w:r>
         <w:rPr>
           <w:i/>
           <w:color w:val="183F92"/>
         </w:rPr>
-        <w:t>Stochastic Environmental Research and Risk Assessment</w:t>
-      </w:r>
-      <w:r>
-        <w:t>. Under review following revision.</w:t>
+        <w:t>PLOS ONE, 20(6), e0326587</w:t>
+      </w:r>
+      <w:r>
+        <w:t xml:space="preserve">, 2025. </w:t>
+      </w:r>
+      <w:r>
+        <w:fldChar w:fldCharType="begin"/>
+      </w:r>
+      <w:r>
+        <w:instrText xml:space="preserve"> HYPERLINK "https://doi.org/10.1371/journal.pone.0326587" \h </w:instrText>
+      </w:r>
+      <w:r>
+        <w:fldChar w:fldCharType="separate"/>
+      </w:r>
+      <w:r>
+        <w:rPr>
+          <w:color w:val="183F92"/>
+        </w:rPr>
+        <w:t>https://doi.org/10.1371/journal.pone.0326587</w:t>
+      </w:r>
+      <w:r>
+        <w:rPr>
+          <w:color w:val="183F92"/>
+        </w:rPr>
+        <w:fldChar w:fldCharType="end"/>
       </w:r>
     </w:p>
     <w:p>
@@ -814,80 +1043,7 @@
         <w:jc w:val="both"/>
       </w:pPr>
       <w:r>
-        <w:t xml:space="preserve">6. Hao Yang, </w:t>
-      </w:r>
-      <w:r>
-        <w:rPr>
-          <w:b/>
-          <w:u w:val="single"/>
-        </w:rPr>
-        <w:t xml:space="preserve">Tianlong Wang</w:t>
-      </w:r>
-      <w:r>
-        <w:t xml:space="preserve">*, Haijun Qiu, Nikita Igorevich Fomin, Shuoting Xiao, Pengyue Zhao. An explainable and metaheuristic-optimized machine learning framework for spatial debris flow risk prediction: Application to the northern China-Pakistan Economic Corridor. </w:t>
-      </w:r>
-      <w:r>
-        <w:rPr>
-          <w:i/>
-          <w:color w:val="183F92"/>
-        </w:rPr>
-        <w:t xml:space="preserve">Stochastic Environmental Research and Risk Assessment</w:t>
-      </w:r>
-      <w:r>
-        <w:t xml:space="preserve">. Under review following second revision.</w:t>
-      </w:r>
-    </w:p>
-    <w:p>
-      <w:pPr>
-        <w:keepNext w:val="0"/>
-        <w:keepLines/>
-        <w:ind w:left="317" w:hanging="317"/>
-        <w:jc w:val="both"/>
-      </w:pPr>
-      <w:r>
-        <w:t xml:space="preserve">7. Yanhui Li, </w:t>
-      </w:r>
-      <w:r>
-        <w:rPr>
-          <w:b/>
-          <w:u w:val="single"/>
-        </w:rPr>
-        <w:t xml:space="preserve">Tianlong Wang</w:t>
-      </w:r>
-      <w:r>
-        <w:t xml:space="preserve">*, Xiaorui Tao. DynaStack: An explainable and robust ensemble framework for trend-based stock price prediction and strategy optimization. </w:t>
-      </w:r>
-      <w:r>
-        <w:rPr>
-          <w:i/>
-          <w:color w:val="183F92"/>
-        </w:rPr>
-        <w:t xml:space="preserve">Journal of Forecasting</w:t>
-      </w:r>
-      <w:r>
-        <w:t xml:space="preserve">. Under review following second revision.</w:t>
-      </w:r>
-    </w:p>
-    <w:p>
-      <w:pPr>
-        <w:pStyle w:val="3"/>
-        <w:pBdr>
-          <w:bottom w:val="single" w:color="777777" w:sz="4" w:space="3"/>
-        </w:pBdr>
-      </w:pPr>
-      <w:r>
-        <w:t>Published papers (first or corresponding author) 13</w:t>
-      </w:r>
-    </w:p>
-    <w:p>
-      <w:pPr>
-        <w:keepNext w:val="0"/>
-        <w:keepLines/>
-        <w:ind w:left="317" w:hanging="317"/>
-        <w:jc w:val="both"/>
-      </w:pPr>
-      <w:r>
-        <w:t xml:space="preserve">1. </w:t>
+        <w:t xml:space="preserve">5. </w:t>
       </w:r>
       <w:r>
         <w:rPr>
@@ -897,23 +1053,23 @@
         <w:t>Tianlong Wang</w:t>
       </w:r>
       <w:r>
-        <w:t xml:space="preserve">*, H. Yang. DOME: A Dynamic Optimization Meta-Ensemble Framework for Debris-Flow Susceptibility Assessment with SHAP-Based Interpretation. </w:t>
+        <w:t xml:space="preserve">, Q. Ge, T. Ma, et al.. A novel method for predicting debris flow hazard: a multi-strategy fusion approach based on the light gradient boosting machine framework. </w:t>
       </w:r>
       <w:r>
         <w:rPr>
           <w:i/>
           <w:color w:val="183F92"/>
         </w:rPr>
-        <w:t>Natural Hazards, 122, Article 545</w:t>
-      </w:r>
-      <w:r>
-        <w:t xml:space="preserve">, 2026. </w:t>
+        <w:t>Stochastic Environmental Research and Risk Assessment, 39, 4867–4890</w:t>
+      </w:r>
+      <w:r>
+        <w:t xml:space="preserve">, 2025. </w:t>
       </w:r>
       <w:r>
         <w:fldChar w:fldCharType="begin"/>
       </w:r>
       <w:r>
-        <w:instrText xml:space="preserve"> HYPERLINK "https://doi.org/10.1007/s11069-026-08307-2" \h </w:instrText>
+        <w:instrText xml:space="preserve"> HYPERLINK "https://doi.org/10.1007/s00477-025-02955-9" \h </w:instrText>
       </w:r>
       <w:r>
         <w:fldChar w:fldCharType="separate"/>
@@ -922,7 +1078,7 @@
         <w:rPr>
           <w:color w:val="183F92"/>
         </w:rPr>
-        <w:t>https://doi.org/10.1007/s11069-026-08307-2</w:t>
+        <w:t>https://doi.org/10.1007/s00477-025-02955-9</w:t>
       </w:r>
       <w:r>
         <w:rPr>
@@ -939,7 +1095,7 @@
         <w:jc w:val="both"/>
       </w:pPr>
       <w:r>
-        <w:t xml:space="preserve">2. </w:t>
+        <w:t xml:space="preserve">6. </w:t>
       </w:r>
       <w:r>
         <w:rPr>
@@ -949,23 +1105,23 @@
         <w:t>Tianlong Wang</w:t>
       </w:r>
       <w:r>
-        <w:t xml:space="preserve">, H. Yang, H. Sun*. Intelligent Prediction of Post-Seismic Debris Flow Source Volumes: A Physics-Informed Generative Deep Learning Framework. </w:t>
+        <w:t xml:space="preserve">, K. Zhang, Z. Liu, T. Ma, R. Luo, H. Chen, X. Wang, W. Ge, H. Sun*. Prediction and explanation of debris flow velocity based on multi-strategy fusion Stacking ensemble learning model. </w:t>
       </w:r>
       <w:r>
         <w:rPr>
           <w:i/>
           <w:color w:val="183F92"/>
         </w:rPr>
-        <w:t>Georisk: Assessment and Management of Risk for Engineered Systems and Geohazards, 1–29</w:t>
-      </w:r>
-      <w:r>
-        <w:t xml:space="preserve">, 2026. </w:t>
+        <w:t>Journal of Hydrology, 638, 131347</w:t>
+      </w:r>
+      <w:r>
+        <w:t xml:space="preserve">, 2024. </w:t>
       </w:r>
       <w:r>
         <w:fldChar w:fldCharType="begin"/>
       </w:r>
       <w:r>
-        <w:instrText xml:space="preserve"> HYPERLINK "https://doi.org/10.1080/17499518.2026.2651228" \h </w:instrText>
+        <w:instrText xml:space="preserve"> HYPERLINK "https://doi.org/10.1016/j.jhydrol.2024.131347" \h </w:instrText>
       </w:r>
       <w:r>
         <w:fldChar w:fldCharType="separate"/>
@@ -974,7 +1130,7 @@
         <w:rPr>
           <w:color w:val="183F92"/>
         </w:rPr>
-        <w:t>https://doi.org/10.1080/17499518.2026.2651228</w:t>
+        <w:t>https://doi.org/10.1016/j.jhydrol.2024.131347</w:t>
       </w:r>
       <w:r>
         <w:rPr>
@@ -991,7 +1147,7 @@
         <w:jc w:val="both"/>
       </w:pPr>
       <w:r>
-        <w:t xml:space="preserve">3. H. Yang, </w:t>
+        <w:t xml:space="preserve">7. </w:t>
       </w:r>
       <w:r>
         <w:rPr>
@@ -1001,23 +1157,23 @@
         <w:t>Tianlong Wang</w:t>
       </w:r>
       <w:r>
-        <w:t xml:space="preserve">*, N. I. Fomin, S. Xiao, L. Liu. An integrated IKOA-CNN-BiGRU-Attention framework with SHAP explainability for high-precision debris flow hazard prediction in the Nujiang river basin, China. </w:t>
+        <w:t xml:space="preserve">, R. Luo, T. Ma, et al.. Study and verification on an improved comprehensive prediction model of landslide displacement. </w:t>
       </w:r>
       <w:r>
         <w:rPr>
           <w:i/>
           <w:color w:val="183F92"/>
         </w:rPr>
-        <w:t>PLOS ONE, 20(6), e0326587</w:t>
-      </w:r>
-      <w:r>
-        <w:t xml:space="preserve">, 2025. </w:t>
+        <w:t>Bulletin of Engineering Geology and the Environment, 83, Article 90</w:t>
+      </w:r>
+      <w:r>
+        <w:t xml:space="preserve">, 2024. </w:t>
       </w:r>
       <w:r>
         <w:fldChar w:fldCharType="begin"/>
       </w:r>
       <w:r>
-        <w:instrText xml:space="preserve"> HYPERLINK "https://doi.org/10.1371/journal.pone.0326587" \h </w:instrText>
+        <w:instrText xml:space="preserve"> HYPERLINK "https://doi.org/10.1007/s10064-024-03581-5" \h </w:instrText>
       </w:r>
       <w:r>
         <w:fldChar w:fldCharType="separate"/>
@@ -1026,7 +1182,7 @@
         <w:rPr>
           <w:color w:val="183F92"/>
         </w:rPr>
-        <w:t>https://doi.org/10.1371/journal.pone.0326587</w:t>
+        <w:t>https://doi.org/10.1007/s10064-024-03581-5</w:t>
       </w:r>
       <w:r>
         <w:rPr>
@@ -1043,7 +1199,7 @@
         <w:jc w:val="both"/>
       </w:pPr>
       <w:r>
-        <w:t xml:space="preserve">4. </w:t>
+        <w:t xml:space="preserve">8. Z. Chu, S. Yu, X. Li, X. Lu, X. Wang, R. Luo, </w:t>
       </w:r>
       <w:r>
         <w:rPr>
@@ -1053,23 +1209,23 @@
         <w:t>Tianlong Wang</w:t>
       </w:r>
       <w:r>
-        <w:t xml:space="preserve">, Q. Ge, T. Ma, et al.. A novel method for predicting debris flow hazard: a multi-strategy fusion approach based on the light gradient boosting machine framework. </w:t>
+        <w:t xml:space="preserve">*. Indoor Model Test of Negative Pressure Drainage Method for Treatment of Engineering Mud. </w:t>
       </w:r>
       <w:r>
         <w:rPr>
           <w:i/>
           <w:color w:val="183F92"/>
         </w:rPr>
-        <w:t>Stochastic Environmental Research and Risk Assessment, 39, 4867–4890</w:t>
-      </w:r>
-      <w:r>
-        <w:t xml:space="preserve">, 2025. </w:t>
+        <w:t>Journal of Changjiang River Scientific Research Institute, 41(9), 114–122, 129. (In Chinese)</w:t>
+      </w:r>
+      <w:r>
+        <w:t xml:space="preserve">, 2024. </w:t>
       </w:r>
       <w:r>
         <w:fldChar w:fldCharType="begin"/>
       </w:r>
       <w:r>
-        <w:instrText xml:space="preserve"> HYPERLINK "https://doi.org/10.1007/s00477-025-02955-9" \h </w:instrText>
+        <w:instrText xml:space="preserve"> HYPERLINK "https://doi.org/10.11988/ckyyb.20230665" \h </w:instrText>
       </w:r>
       <w:r>
         <w:fldChar w:fldCharType="separate"/>
@@ -1078,7 +1234,7 @@
         <w:rPr>
           <w:color w:val="183F92"/>
         </w:rPr>
-        <w:t>https://doi.org/10.1007/s00477-025-02955-9</w:t>
+        <w:t>https://doi.org/10.11988/ckyyb.20230665</w:t>
       </w:r>
       <w:r>
         <w:rPr>
@@ -1095,7 +1251,7 @@
         <w:jc w:val="both"/>
       </w:pPr>
       <w:r>
-        <w:t xml:space="preserve">5. </w:t>
+        <w:t xml:space="preserve">9. </w:t>
       </w:r>
       <w:r>
         <w:rPr>
@@ -1105,14 +1261,14 @@
         <w:t>Tianlong Wang</w:t>
       </w:r>
       <w:r>
-        <w:t xml:space="preserve">, K. Zhang, Z. Liu, T. Ma, R. Luo, H. Chen, X. Wang, W. Ge, H. Sun*. Prediction and explanation of debris flow velocity based on multi-strategy fusion Stacking ensemble learning model. </w:t>
+        <w:t xml:space="preserve">, D. Peng, X. Wang, B. Wu, R. Luo, Z. Chu, H. Sun*. Study on wavelet multi-scale analysis and prediction of landslide groundwater. </w:t>
       </w:r>
       <w:r>
         <w:rPr>
           <w:i/>
           <w:color w:val="183F92"/>
         </w:rPr>
-        <w:t>Journal of Hydrology, 638, 131347</w:t>
+        <w:t>Journal of Hydroinformatics, 26(1), 237–254</w:t>
       </w:r>
       <w:r>
         <w:t xml:space="preserve">, 2024. </w:t>
@@ -1121,7 +1277,7 @@
         <w:fldChar w:fldCharType="begin"/>
       </w:r>
       <w:r>
-        <w:instrText xml:space="preserve"> HYPERLINK "https://doi.org/10.1016/j.jhydrol.2024.131347" \h </w:instrText>
+        <w:instrText xml:space="preserve"> HYPERLINK "https://doi.org/10.2166/hydro.2023.299" \h </w:instrText>
       </w:r>
       <w:r>
         <w:fldChar w:fldCharType="separate"/>
@@ -1130,7 +1286,7 @@
         <w:rPr>
           <w:color w:val="183F92"/>
         </w:rPr>
-        <w:t>https://doi.org/10.1016/j.jhydrol.2024.131347</w:t>
+        <w:t>https://doi.org/10.2166/hydro.2023.299</w:t>
       </w:r>
       <w:r>
         <w:rPr>
@@ -1147,7 +1303,7 @@
         <w:jc w:val="both"/>
       </w:pPr>
       <w:r>
-        <w:t xml:space="preserve">6. </w:t>
+        <w:t xml:space="preserve">10. </w:t>
       </w:r>
       <w:r>
         <w:rPr>
@@ -1157,23 +1313,23 @@
         <w:t>Tianlong Wang</w:t>
       </w:r>
       <w:r>
-        <w:t xml:space="preserve">, R. Luo, T. Ma, et al.. Study and verification on an improved comprehensive prediction model of landslide displacement. </w:t>
+        <w:t xml:space="preserve">, Xiaorui Tao, Dong-kun Wu, Haotian Feng. Determining the location of River Dam Group based on set cover Model: A case study of Zambezi River Basin. </w:t>
       </w:r>
       <w:r>
         <w:rPr>
           <w:i/>
           <w:color w:val="183F92"/>
         </w:rPr>
-        <w:t>Bulletin of Engineering Geology and the Environment, 83, Article 90</w:t>
-      </w:r>
-      <w:r>
-        <w:t xml:space="preserve">, 2024. </w:t>
+        <w:t>Scientific Research and Reviews, 14, 122</w:t>
+      </w:r>
+      <w:r>
+        <w:t xml:space="preserve">, 2021. </w:t>
       </w:r>
       <w:r>
         <w:fldChar w:fldCharType="begin"/>
       </w:r>
       <w:r>
-        <w:instrText xml:space="preserve"> HYPERLINK "https://doi.org/10.1007/s10064-024-03581-5" \h </w:instrText>
+        <w:instrText xml:space="preserve"> HYPERLINK "https://doi.org/10.28933/srr-2021-03-1005" \h </w:instrText>
       </w:r>
       <w:r>
         <w:fldChar w:fldCharType="separate"/>
@@ -1182,7 +1338,7 @@
         <w:rPr>
           <w:color w:val="183F92"/>
         </w:rPr>
-        <w:t>https://doi.org/10.1007/s10064-024-03581-5</w:t>
+        <w:t>https://doi.org/10.28933/srr-2021-03-1005</w:t>
       </w:r>
       <w:r>
         <w:rPr>
@@ -1199,7 +1355,7 @@
         <w:jc w:val="both"/>
       </w:pPr>
       <w:r>
-        <w:t xml:space="preserve">7. Z. Chu, S. Yu, X. Li, X. Lu, X. Wang, R. Luo, </w:t>
+        <w:t xml:space="preserve">11. </w:t>
       </w:r>
       <w:r>
         <w:rPr>
@@ -1209,23 +1365,23 @@
         <w:t>Tianlong Wang</w:t>
       </w:r>
       <w:r>
-        <w:t xml:space="preserve">*. Indoor Model Test of Negative Pressure Drainage Method for Treatment of Engineering Mud. </w:t>
+        <w:t xml:space="preserve">, J. Wang, X. Shao. Carbon emission forecast of China Transport Industry Based on Grey - Markov. </w:t>
       </w:r>
       <w:r>
         <w:rPr>
           <w:i/>
           <w:color w:val="183F92"/>
         </w:rPr>
-        <w:t>Journal of Changjiang River Scientific Research Institute, 41(9), 114–122, 129. (In Chinese)</w:t>
-      </w:r>
-      <w:r>
-        <w:t xml:space="preserve">, 2024. </w:t>
+        <w:t>International Conference on Computing and Big Data (ICCBD)</w:t>
+      </w:r>
+      <w:r>
+        <w:t xml:space="preserve">, 2021. </w:t>
       </w:r>
       <w:r>
         <w:fldChar w:fldCharType="begin"/>
       </w:r>
       <w:r>
-        <w:instrText xml:space="preserve"> HYPERLINK "https://doi.org/10.11988/ckyyb.20230665" \h </w:instrText>
+        <w:instrText xml:space="preserve"> HYPERLINK "https://doi.org/10.1109/ICCBD53833.2021.00192" \h </w:instrText>
       </w:r>
       <w:r>
         <w:fldChar w:fldCharType="separate"/>
@@ -1234,7 +1390,7 @@
         <w:rPr>
           <w:color w:val="183F92"/>
         </w:rPr>
-        <w:t>https://doi.org/10.11988/ckyyb.20230665</w:t>
+        <w:t>https://doi.org/10.1109/ICCBD53833.2021.00192</w:t>
       </w:r>
       <w:r>
         <w:rPr>
@@ -1251,7 +1407,7 @@
         <w:jc w:val="both"/>
       </w:pPr>
       <w:r>
-        <w:t xml:space="preserve">8. </w:t>
+        <w:t xml:space="preserve">12. </w:t>
       </w:r>
       <w:r>
         <w:rPr>
@@ -1261,23 +1417,23 @@
         <w:t>Tianlong Wang</w:t>
       </w:r>
       <w:r>
-        <w:t xml:space="preserve">, D. Peng, X. Wang, B. Wu, R. Luo, Z. Chu, H. Sun*. Study on wavelet multi-scale analysis and prediction of landslide groundwater. </w:t>
+        <w:t xml:space="preserve">, H. Zhang, X. Tao, W. Chu. Research on Prediction and Optimization of Slope Deformation in Mining Area. </w:t>
       </w:r>
       <w:r>
         <w:rPr>
           <w:i/>
           <w:color w:val="183F92"/>
         </w:rPr>
-        <w:t>Journal of Hydroinformatics, 26(1), 237–254</w:t>
-      </w:r>
-      <w:r>
-        <w:t xml:space="preserve">, 2024. </w:t>
+        <w:t>Environment, Resource and Ecology Journal, 4, 66–69</w:t>
+      </w:r>
+      <w:r>
+        <w:t xml:space="preserve">, 2020. </w:t>
       </w:r>
       <w:r>
         <w:fldChar w:fldCharType="begin"/>
       </w:r>
       <w:r>
-        <w:instrText xml:space="preserve"> HYPERLINK "https://doi.org/10.2166/hydro.2023.299" \h </w:instrText>
+        <w:instrText xml:space="preserve"> HYPERLINK "https://doi.org/10.23977/erej.2020.040110" \h </w:instrText>
       </w:r>
       <w:r>
         <w:fldChar w:fldCharType="separate"/>
@@ -1286,7 +1442,7 @@
         <w:rPr>
           <w:color w:val="183F92"/>
         </w:rPr>
-        <w:t>https://doi.org/10.2166/hydro.2023.299</w:t>
+        <w:t>https://doi.org/10.23977/erej.2020.040110</w:t>
       </w:r>
       <w:r>
         <w:rPr>
@@ -1303,7 +1459,7 @@
         <w:jc w:val="both"/>
       </w:pPr>
       <w:r>
-        <w:t xml:space="preserve">9. </w:t>
+        <w:t xml:space="preserve">13. </w:t>
       </w:r>
       <w:r>
         <w:rPr>
@@ -1313,162 +1469,6 @@
         <w:t>Tianlong Wang</w:t>
       </w:r>
       <w:r>
-        <w:t xml:space="preserve">, Xiaorui Tao, Dong-kun Wu, Haotian Feng. Determining the location of River Dam Group based on set cover Model: A case study of Zambezi River Basin. </w:t>
-      </w:r>
-      <w:r>
-        <w:rPr>
-          <w:i/>
-          <w:color w:val="183F92"/>
-        </w:rPr>
-        <w:t>Scientific Research and Reviews, 14, 122</w:t>
-      </w:r>
-      <w:r>
-        <w:t xml:space="preserve">, 2021. </w:t>
-      </w:r>
-      <w:r>
-        <w:fldChar w:fldCharType="begin"/>
-      </w:r>
-      <w:r>
-        <w:instrText xml:space="preserve"> HYPERLINK "https://doi.org/10.28933/srr-2021-03-1005" \h </w:instrText>
-      </w:r>
-      <w:r>
-        <w:fldChar w:fldCharType="separate"/>
-      </w:r>
-      <w:r>
-        <w:rPr>
-          <w:color w:val="183F92"/>
-        </w:rPr>
-        <w:t>https://doi.org/10.28933/srr-2021-03-1005</w:t>
-      </w:r>
-      <w:r>
-        <w:rPr>
-          <w:color w:val="183F92"/>
-        </w:rPr>
-        <w:fldChar w:fldCharType="end"/>
-      </w:r>
-    </w:p>
-    <w:p>
-      <w:pPr>
-        <w:keepNext w:val="0"/>
-        <w:keepLines/>
-        <w:ind w:left="317" w:hanging="317"/>
-        <w:jc w:val="both"/>
-      </w:pPr>
-      <w:r>
-        <w:t xml:space="preserve">10. </w:t>
-      </w:r>
-      <w:r>
-        <w:rPr>
-          <w:b/>
-          <w:u w:val="single"/>
-        </w:rPr>
-        <w:t>Tianlong Wang</w:t>
-      </w:r>
-      <w:r>
-        <w:t xml:space="preserve">, J. Wang, X. Shao. Carbon emission forecast of China Transport Industry Based on Grey - Markov. </w:t>
-      </w:r>
-      <w:r>
-        <w:rPr>
-          <w:i/>
-          <w:color w:val="183F92"/>
-        </w:rPr>
-        <w:t>International Conference on Computing and Big Data (ICCBD)</w:t>
-      </w:r>
-      <w:r>
-        <w:t xml:space="preserve">, 2021. </w:t>
-      </w:r>
-      <w:r>
-        <w:fldChar w:fldCharType="begin"/>
-      </w:r>
-      <w:r>
-        <w:instrText xml:space="preserve"> HYPERLINK "https://doi.org/10.1109/ICCBD53833.2021.00192" \h </w:instrText>
-      </w:r>
-      <w:r>
-        <w:fldChar w:fldCharType="separate"/>
-      </w:r>
-      <w:r>
-        <w:rPr>
-          <w:color w:val="183F92"/>
-        </w:rPr>
-        <w:t>https://doi.org/10.1109/ICCBD53833.2021.00192</w:t>
-      </w:r>
-      <w:r>
-        <w:rPr>
-          <w:color w:val="183F92"/>
-        </w:rPr>
-        <w:fldChar w:fldCharType="end"/>
-      </w:r>
-    </w:p>
-    <w:p>
-      <w:pPr>
-        <w:keepNext w:val="0"/>
-        <w:keepLines/>
-        <w:ind w:left="317" w:hanging="317"/>
-        <w:jc w:val="both"/>
-      </w:pPr>
-      <w:r>
-        <w:t xml:space="preserve">11. </w:t>
-      </w:r>
-      <w:r>
-        <w:rPr>
-          <w:b/>
-          <w:u w:val="single"/>
-        </w:rPr>
-        <w:t>Tianlong Wang</w:t>
-      </w:r>
-      <w:r>
-        <w:t xml:space="preserve">, H. Zhang, X. Tao, W. Chu. Research on Prediction and Optimization of Slope Deformation in Mining Area. </w:t>
-      </w:r>
-      <w:r>
-        <w:rPr>
-          <w:i/>
-          <w:color w:val="183F92"/>
-        </w:rPr>
-        <w:t>Environment, Resource and Ecology Journal, 4, 66–69</w:t>
-      </w:r>
-      <w:r>
-        <w:t xml:space="preserve">, 2020. </w:t>
-      </w:r>
-      <w:r>
-        <w:fldChar w:fldCharType="begin"/>
-      </w:r>
-      <w:r>
-        <w:instrText xml:space="preserve"> HYPERLINK "https://doi.org/10.23977/erej.2020.040110" \h </w:instrText>
-      </w:r>
-      <w:r>
-        <w:fldChar w:fldCharType="separate"/>
-      </w:r>
-      <w:r>
-        <w:rPr>
-          <w:color w:val="183F92"/>
-        </w:rPr>
-        <w:t>https://doi.org/10.23977/erej.2020.040110</w:t>
-      </w:r>
-      <w:r>
-        <w:rPr>
-          <w:color w:val="183F92"/>
-        </w:rPr>
-        <w:fldChar w:fldCharType="end"/>
-      </w:r>
-    </w:p>
-    <w:p>
-      <w:pPr>
-        <w:keepNext w:val="0"/>
-        <w:keepLines/>
-        <w:ind w:left="317" w:hanging="317"/>
-        <w:jc w:val="both"/>
-      </w:pPr>
-      <w:r>
-        <w:t xml:space="preserve">12. </w:t>
-      </w:r>
-      <w:r>
-        <w:rPr>
-          <w:b/>
-          <w:u w:val="single"/>
-        </w:rPr>
-        <w:t>Tianlong Wang</w:t>
-      </w:r>
-      <w:r>
         <w:t xml:space="preserve">, Hongyan Bao, Hairui Zhang. Optimization of Task Pricing Based on Multiple Regression Analysis and Game Theory. </w:t>
       </w:r>
       <w:r>
@@ -1511,7 +1511,7 @@
         <w:jc w:val="both"/>
       </w:pPr>
       <w:r>
-        <w:t xml:space="preserve">13. </w:t>
+        <w:t xml:space="preserve">14. </w:t>
       </w:r>
       <w:r>
         <w:rPr>

</xml_diff>

<commit_message>
Unify publication totals across homepage, CV and downloads
</commit_message>
<xml_diff>
--- a/assets/files/Tianlong_Wang_CV.docx
+++ b/assets/files/Tianlong_Wang_CV.docx
@@ -274,10 +274,13 @@
         <w:rPr>
           <w:b/>
         </w:rPr>
-        <w:t xml:space="preserve">Research outputs: </w:t>
-      </w:r>
-      <w:r>
-        <w:t>13 first- or corresponding-author publications (12 journal articles and 1 conference paper); 1 accepted article; 6 manuscripts under review; 8 invention-patent records (3 grant publications and 5 application publications); 6 open-source research software projects.</w:t>
+        <w:t xml:space="preserve">Research outputs:</w:t>
+      </w:r>
+      <w:r>
+        <w:rPr>
+          <w:b w:val="0"/>
+        </w:rPr>
+        <w:t xml:space="preserve"> 14 published or accepted first- or corresponding-author publications (13 journal articles and 1 conference paper); 6 manuscripts under review; 8 invention-patent records (3 grant publications and 5 application publications); 6 open-source research software projects.</w:t>
       </w:r>
     </w:p>
     <w:p>

</xml_diff>

<commit_message>
Update BWSD publication, dataset and code links across homepage and CV
</commit_message>
<xml_diff>
--- a/assets/files/Tianlong_Wang_CV.docx
+++ b/assets/files/Tianlong_Wang_CV.docx
@@ -869,7 +869,7 @@
         <w:t>Tianlong Wang</w:t>
       </w:r>
       <w:r>
-        <w:t xml:space="preserve">, Jian Chu, Hao Yang, Hongyue Sun*. Basin Water Storage Degree for Risk-Informed Debris-Flow Warning Support: A Forward-Looking Proof of Concept in a Small Mountain Catchment. </w:t>
+        <w:t xml:space="preserve">, Jian Chu, Hao Yang, Hongyue Sun*. Basin water storage degree for risk-informed debris-flow warning support: A forward-looking proof of concept in a small mountain catchment. </w:t>
       </w:r>
       <w:r>
         <w:rPr>
@@ -879,8 +879,38 @@
         <w:t>International Journal of Disaster Risk Reduction</w:t>
       </w:r>
       <w:r>
-        <w:t>. Accepted 9 October 2026; in production.</w:t>
-      </w:r>
+        <w:t xml:space="preserve">, 146, 106496 (2026). </w:t>
+      </w:r>
+      <w:hyperlink r:id="rId10">
+        <w:r>
+          <w:rPr>
+            <w:color w:val="183F92"/>
+          </w:rPr>
+          <w:t>Article DOI</w:t>
+        </w:r>
+      </w:hyperlink>
+      <w:r>
+        <w:t xml:space="preserve"> | </w:t>
+      </w:r>
+      <w:hyperlink r:id="rId11">
+        <w:r>
+          <w:rPr>
+            <w:color w:val="183F92"/>
+          </w:rPr>
+          <w:t>Data</w:t>
+        </w:r>
+      </w:hyperlink>
+      <w:r>
+        <w:t xml:space="preserve"> | </w:t>
+      </w:r>
+      <w:hyperlink r:id="rId12">
+        <w:r>
+          <w:rPr>
+            <w:color w:val="183F92"/>
+          </w:rPr>
+          <w:t>Code</w:t>
+        </w:r>
+      </w:hyperlink>
     </w:p>
     <w:p>
       <w:pPr>
@@ -2113,7 +2143,7 @@
         <w:t>BWSD</w:t>
       </w:r>
       <w:r>
-        <w:t xml:space="preserve">. Water-balance-based catchment storage indicator and daily hydrological-state classification. </w:t>
+        <w:t xml:space="preserve">. Reproducible apparent-storage assessment with sequential reference updating, sensitivity analysis and uncertainty propagation. </w:t>
       </w:r>
       <w:r>
         <w:fldChar w:fldCharType="begin"/>

</xml_diff>

<commit_message>
Add annual Zhejiang University honors to homepage and CV
</commit_message>
<xml_diff>
--- a/assets/files/Tianlong_Wang_CV.docx
+++ b/assets/files/Tianlong_Wang_CV.docx
@@ -293,7 +293,7 @@
         <w:rPr>
           <w:b w:val="0"/>
         </w:rPr>
-        <w:t>Lead investigator on 6 research and innovation projects, including 4 funded awards with recorded support totalling RMB 136,000; contributor to 7 collaborative projects; separate CSC joint-training support of RMB 300,000. The record includes 10 honors and scholarship entries and 12 competition-award entries; reviewer for 16 journals and member of 3 professional societies.</w:t>
+        <w:t>Lead investigator on 6 research and innovation projects, including 4 funded awards with recorded support totalling RMB 136,000; contributor to 7 collaborative projects; separate CSC joint-training support of RMB 300,000. The record includes 12 honors and scholarship entries and 12 competition-award entries; reviewer for 16 journals and member of 3 professional societies.</w:t>
       </w:r>
     </w:p>
     <w:p>
@@ -2261,7 +2261,7 @@
         </w:pBdr>
       </w:pPr>
       <w:r>
-        <w:t>Honors scholarships and competition awards 22 entries</w:t>
+        <w:t>Honors scholarships and competition awards 24 entries</w:t>
       </w:r>
     </w:p>
     <w:p>
@@ -2280,7 +2280,7 @@
         <w:jc w:val="both"/>
       </w:pPr>
       <w:r>
-        <w:t>1. National Scholarship; 2025.</w:t>
+        <w:t>1. Outstanding Graduate Student, Zhejiang University; 2023–2026 (four consecutive years).</w:t>
       </w:r>
     </w:p>
     <w:p>
@@ -2291,7 +2291,7 @@
         <w:jc w:val="both"/>
       </w:pPr>
       <w:r>
-        <w:t>2. Chinese Government Scholarship, China Scholarship Council; 2024.</w:t>
+        <w:t>2. Five-Good Graduate Student, Zhejiang University; 2023–2026 (four consecutive years).</w:t>
       </w:r>
     </w:p>
     <w:p>
@@ -2302,7 +2302,7 @@
         <w:jc w:val="both"/>
       </w:pPr>
       <w:r>
-        <w:t>3. China Harbour Engineering Company Scholarship; 2023.</w:t>
+        <w:t>3. National Scholarship; 2025.</w:t>
       </w:r>
     </w:p>
     <w:p>
@@ -2313,7 +2313,7 @@
         <w:jc w:val="both"/>
       </w:pPr>
       <w:r>
-        <w:t>4. Outstanding Graduate, Chinese Society for Rock Mechanics and Engineering; one of 100 recipients nationwide; 2022.</w:t>
+        <w:t>4. Chinese Government Scholarship, China Scholarship Council; 2024.</w:t>
       </w:r>
     </w:p>
     <w:p>
@@ -2324,7 +2324,7 @@
         <w:jc w:val="both"/>
       </w:pPr>
       <w:r>
-        <w:t>5. Outstanding Graduate, university level; 2022.</w:t>
+        <w:t>5. China Harbour Engineering Company Scholarship; 2023.</w:t>
       </w:r>
     </w:p>
     <w:p>
@@ -2335,7 +2335,7 @@
         <w:jc w:val="both"/>
       </w:pPr>
       <w:r>
-        <w:t>6. Yunneng Electric Power Innovation Scholarship; 2022.</w:t>
+        <w:t>6. Outstanding Graduate, Chinese Society for Rock Mechanics and Engineering; one of 100 recipients nationwide; 2022.</w:t>
       </w:r>
     </w:p>
     <w:p>
@@ -2346,7 +2346,7 @@
         <w:jc w:val="both"/>
       </w:pPr>
       <w:r>
-        <w:t>7. National Scholarship; 2021.</w:t>
+        <w:t>7. Outstanding Graduate, university level; 2022.</w:t>
       </w:r>
     </w:p>
     <w:p>
@@ -2357,7 +2357,7 @@
         <w:jc w:val="both"/>
       </w:pPr>
       <w:r>
-        <w:t>8. Wang Shuopeng Scholarship; 2020.</w:t>
+        <w:t>8. Yunneng Electric Power Innovation Scholarship; 2022.</w:t>
       </w:r>
     </w:p>
     <w:p>
@@ -2368,7 +2368,7 @@
         <w:jc w:val="both"/>
       </w:pPr>
       <w:r>
-        <w:t>9. First-Class Academic Scholarship, four consecutive years; 2019–2022.</w:t>
+        <w:t>9. National Scholarship; 2021.</w:t>
       </w:r>
     </w:p>
     <w:p>
@@ -2379,7 +2379,29 @@
         <w:jc w:val="both"/>
       </w:pPr>
       <w:r>
-        <w:t>10. National Encouragement Scholarship, three consecutive years; 2019–2021.</w:t>
+        <w:t>10. Wang Shuopeng Scholarship; 2020.</w:t>
+      </w:r>
+    </w:p>
+    <w:p>
+      <w:pPr>
+        <w:keepNext w:val="0"/>
+        <w:keepLines/>
+        <w:ind w:left="317" w:hanging="317"/>
+        <w:jc w:val="both"/>
+      </w:pPr>
+      <w:r>
+        <w:t>11. First-Class Academic Scholarship, four consecutive years; 2019–2022.</w:t>
+      </w:r>
+    </w:p>
+    <w:p>
+      <w:pPr>
+        <w:keepNext w:val="0"/>
+        <w:keepLines/>
+        <w:ind w:left="317" w:hanging="317"/>
+        <w:jc w:val="both"/>
+      </w:pPr>
+      <w:r>
+        <w:t>12. National Encouragement Scholarship, three consecutive years; 2019–2021.</w:t>
       </w:r>
     </w:p>
     <w:p>

</xml_diff>

<commit_message>
Record rainfall-induced landslide patent grant and synchronize CV
</commit_message>
<xml_diff>
--- a/assets/files/Tianlong_Wang_CV.docx
+++ b/assets/files/Tianlong_Wang_CV.docx
@@ -280,7 +280,7 @@
         <w:rPr>
           <w:b w:val="0"/>
         </w:rPr>
-        <w:t xml:space="preserve"> 14 published or accepted first- or corresponding-author publications (13 journal articles and 1 conference paper); 6 manuscripts under review; 8 invention-patent records (3 grant publications and 5 application publications); 6 open-source research software projects.</w:t>
+        <w:t xml:space="preserve"> 14 published or accepted first- or corresponding-author publications (13 journal articles and 1 conference paper); 6 manuscripts under review; 8 invention-patent records (4 grant publications and 4 application publications); 6 open-source research software projects.</w:t>
       </w:r>
     </w:p>
     <w:p>
@@ -1604,7 +1604,7 @@
         <w:pStyle w:val="4"/>
       </w:pPr>
       <w:r>
-        <w:t>Grant publications 3</w:t>
+        <w:t>Grant publications 4</w:t>
       </w:r>
     </w:p>
     <w:p>
@@ -1615,7 +1615,7 @@
         <w:jc w:val="both"/>
       </w:pPr>
       <w:r>
-        <w:t xml:space="preserve">1. J. Liu, Z. Li, </w:t>
+        <w:t xml:space="preserve">1. X. Wang, H. Sun, </w:t>
       </w:r>
       <w:r>
         <w:rPr>
@@ -1625,13 +1625,13 @@
         <w:t>Tianlong Wang</w:t>
       </w:r>
       <w:r>
-        <w:t xml:space="preserve">, et al.. Eccentric Hook-shaped Expansible Pre-stressed Anchoring Structure and Its Anchoring Method. China; CN113718767B; 2023. </w:t>
+        <w:t xml:space="preserve">, R. Tang, R. Luo. Monitoring and Early Warning Method and System for Rainfall-induced Landslides. China; ZL202410081965.1; CN117854239B; granted 20 October 2026. </w:t>
       </w:r>
       <w:r>
         <w:fldChar w:fldCharType="begin"/>
       </w:r>
       <w:r>
-        <w:instrText xml:space="preserve"> HYPERLINK "https://patents.google.com/patent/CN113718767B/en" \h </w:instrText>
+        <w:instrText xml:space="preserve"> HYPERLINK "https://patents.google.com/patent/CN117854239A/en" \h </w:instrText>
       </w:r>
       <w:r>
         <w:fldChar w:fldCharType="separate"/>
@@ -1657,7 +1657,7 @@
         <w:jc w:val="both"/>
       </w:pPr>
       <w:r>
-        <w:t xml:space="preserve">2. J. Liu, Q. Shi, Z. Wei, S. Li, L. Tang, </w:t>
+        <w:t xml:space="preserve">2. J. Liu, Z. Li, </w:t>
       </w:r>
       <w:r>
         <w:rPr>
@@ -1667,13 +1667,13 @@
         <w:t>Tianlong Wang</w:t>
       </w:r>
       <w:r>
-        <w:t xml:space="preserve">, et al.. Device and Method for Obtaining the Position of Liquid Displacement Surface in Rock Cracks. China; CN111595550B; 2022. </w:t>
+        <w:t xml:space="preserve">, et al.. Eccentric Hook-shaped Expansible Pre-stressed Anchoring Structure and Its Anchoring Method. China; CN113718767B; 2023. </w:t>
       </w:r>
       <w:r>
         <w:fldChar w:fldCharType="begin"/>
       </w:r>
       <w:r>
-        <w:instrText xml:space="preserve"> HYPERLINK "https://patents.google.com/patent/CN111595550B/en" \h </w:instrText>
+        <w:instrText xml:space="preserve"> HYPERLINK "https://patents.google.com/patent/CN113718767B/en" \h </w:instrText>
       </w:r>
       <w:r>
         <w:fldChar w:fldCharType="separate"/>
@@ -1709,13 +1709,13 @@
         <w:t>Tianlong Wang</w:t>
       </w:r>
       <w:r>
-        <w:t xml:space="preserve">, et al.. Pile Structure and Construction Method in Coral Sand Environment. China; CN110886291B; 2021. </w:t>
+        <w:t xml:space="preserve">, et al.. Device and Method for Obtaining the Position of Liquid Displacement Surface in Rock Cracks. China; CN111595550B; 2022. </w:t>
       </w:r>
       <w:r>
         <w:fldChar w:fldCharType="begin"/>
       </w:r>
       <w:r>
-        <w:instrText xml:space="preserve"> HYPERLINK "https://patents.google.com/patent/CN110886291B/en" \h </w:instrText>
+        <w:instrText xml:space="preserve"> HYPERLINK "https://patents.google.com/patent/CN111595550B/en" \h </w:instrText>
       </w:r>
       <w:r>
         <w:fldChar w:fldCharType="separate"/>
@@ -1735,21 +1735,13 @@
     </w:p>
     <w:p>
       <w:pPr>
-        <w:pStyle w:val="4"/>
-      </w:pPr>
-      <w:r>
-        <w:t>Published applications 5</w:t>
-      </w:r>
-    </w:p>
-    <w:p>
-      <w:pPr>
         <w:keepNext w:val="0"/>
         <w:keepLines/>
         <w:ind w:left="317" w:hanging="317"/>
         <w:jc w:val="both"/>
       </w:pPr>
       <w:r>
-        <w:t xml:space="preserve">1. H. Sun, X. Wang, </w:t>
+        <w:t xml:space="preserve">4. J. Liu, Q. Shi, Z. Wei, S. Li, L. Tang, </w:t>
       </w:r>
       <w:r>
         <w:rPr>
@@ -1759,13 +1751,13 @@
         <w:t>Tianlong Wang</w:t>
       </w:r>
       <w:r>
-        <w:t xml:space="preserve">, R. Tang, R. Luo. Monitoring and Early Warning Method and System for Rainfall-induced Landslides. Japan; application 2024-017304; JP2025113090A; 2025. </w:t>
+        <w:t xml:space="preserve">, et al.. Pile Structure and Construction Method in Coral Sand Environment. China; CN110886291B; 2021. </w:t>
       </w:r>
       <w:r>
         <w:fldChar w:fldCharType="begin"/>
       </w:r>
       <w:r>
-        <w:instrText xml:space="preserve"> HYPERLINK "https://jglobal.jst.go.jp/public/202503017599036180" \h </w:instrText>
+        <w:instrText xml:space="preserve"> HYPERLINK "https://patents.google.com/patent/CN110886291B/en" \h </w:instrText>
       </w:r>
       <w:r>
         <w:fldChar w:fldCharType="separate"/>
@@ -1785,13 +1777,21 @@
     </w:p>
     <w:p>
       <w:pPr>
+        <w:pStyle w:val="4"/>
+      </w:pPr>
+      <w:r>
+        <w:t>Published applications 4</w:t>
+      </w:r>
+    </w:p>
+    <w:p>
+      <w:pPr>
         <w:keepNext w:val="0"/>
         <w:keepLines/>
         <w:ind w:left="317" w:hanging="317"/>
         <w:jc w:val="both"/>
       </w:pPr>
       <w:r>
-        <w:t xml:space="preserve">2. X. Wang, H. Sun, S. Shao, R. Luo, </w:t>
+        <w:t xml:space="preserve">1. H. Sun, X. Wang, </w:t>
       </w:r>
       <w:r>
         <w:rPr>
@@ -1801,13 +1801,13 @@
         <w:t>Tianlong Wang</w:t>
       </w:r>
       <w:r>
-        <w:t xml:space="preserve">. Early Warning and Mitigation Method for Debris Flow Disasters in Small Watersheds. China; CN118262481A; 2024. </w:t>
+        <w:t xml:space="preserve">, R. Tang, R. Luo. Monitoring and Early Warning Method and System for Rainfall-induced Landslides. Japan; application 2024-017304; JP2025113090A; 2025. </w:t>
       </w:r>
       <w:r>
         <w:fldChar w:fldCharType="begin"/>
       </w:r>
       <w:r>
-        <w:instrText xml:space="preserve"> HYPERLINK "https://patents.google.com/patent/CN118262481A/en" \h </w:instrText>
+        <w:instrText xml:space="preserve"> HYPERLINK "https://jglobal.jst.go.jp/public/202503017599036180" \h </w:instrText>
       </w:r>
       <w:r>
         <w:fldChar w:fldCharType="separate"/>
@@ -1833,7 +1833,7 @@
         <w:jc w:val="both"/>
       </w:pPr>
       <w:r>
-        <w:t xml:space="preserve">3. X. Wang, H. Sun, </w:t>
+        <w:t xml:space="preserve">2. X. Wang, H. Sun, S. Shao, R. Luo, </w:t>
       </w:r>
       <w:r>
         <w:rPr>
@@ -1843,13 +1843,13 @@
         <w:t>Tianlong Wang</w:t>
       </w:r>
       <w:r>
-        <w:t xml:space="preserve">, R. Tang, R. Luo. Monitoring and Early Warning Method and System for Rainfall-induced Landslides. China; CN117854239A; 2024. </w:t>
+        <w:t xml:space="preserve">. Early Warning and Mitigation Method for Debris Flow Disasters in Small Watersheds. China; CN118262481A; 2024. </w:t>
       </w:r>
       <w:r>
         <w:fldChar w:fldCharType="begin"/>
       </w:r>
       <w:r>
-        <w:instrText xml:space="preserve"> HYPERLINK "https://patents.google.com/patent/CN117854239A/en" \h </w:instrText>
+        <w:instrText xml:space="preserve"> HYPERLINK "https://patents.google.com/patent/CN118262481A/en" \h </w:instrText>
       </w:r>
       <w:r>
         <w:fldChar w:fldCharType="separate"/>
@@ -1875,7 +1875,7 @@
         <w:jc w:val="both"/>
       </w:pPr>
       <w:r>
-        <w:t xml:space="preserve">4. </w:t>
+        <w:t xml:space="preserve">3. </w:t>
       </w:r>
       <w:r>
         <w:rPr>
@@ -1917,7 +1917,7 @@
         <w:jc w:val="both"/>
       </w:pPr>
       <w:r>
-        <w:t xml:space="preserve">5. J. Liu, Z. Li, </w:t>
+        <w:t xml:space="preserve">4. J. Liu, Z. Li, </w:t>
       </w:r>
       <w:r>
         <w:rPr>

</xml_diff>

<commit_message>
Link patent grant certificate and synchronize downloadable CV
</commit_message>
<xml_diff>
--- a/assets/files/Tianlong_Wang_CV.docx
+++ b/assets/files/Tianlong_Wang_CV.docx
@@ -293,7 +293,7 @@
         <w:rPr>
           <w:b w:val="0"/>
         </w:rPr>
-        <w:t>Lead investigator on 6 research and innovation projects, including 4 funded awards with recorded support totalling RMB 136,000; contributor to 7 collaborative projects; separate CSC joint-training support of RMB 300,000. The record includes 12 honors and scholarship entries and 12 competition-award entries; reviewer for 16 journals and member of 3 professional societies.</w:t>
+        <w:t>Lead investigator on 6 research and innovation projects, including 4 funded awards with recorded support totalling RMB 136,000; contributor to 7 collaborative projects; separate CSC joint-training support of RMB 300,000. The record includes 12 honors and scholarship entries and 12 competition-award entries; reviewer for 17 journals and member of 3 professional societies.</w:t>
       </w:r>
     </w:p>
     <w:p>
@@ -1625,13 +1625,13 @@
         <w:t>Tianlong Wang</w:t>
       </w:r>
       <w:r>
-        <w:t xml:space="preserve">, R. Tang, R. Luo. Monitoring and Early Warning Method and System for Rainfall-induced Landslides. China; ZL202410081965.1; CN117854239B; granted 20 October 2026. </w:t>
+        <w:t xml:space="preserve">, R. Tang, R. Luo. Monitoring and Early Warning Method and System for Rainfall-induced Landslides. China; ZL202410081965.1; CN117854239B; granted 20 October 2026; patent holder: Zhejiang University. </w:t>
       </w:r>
       <w:r>
         <w:fldChar w:fldCharType="begin"/>
       </w:r>
       <w:r>
-        <w:instrText xml:space="preserve"> HYPERLINK "https://patents.google.com/patent/CN117854239A/en" \h </w:instrText>
+        <w:instrText xml:space="preserve"> HYPERLINK "https://zjusuge.github.io/assets/files/patents/CN117854239B-grant-certificate.pdf" \h </w:instrText>
       </w:r>
       <w:r>
         <w:fldChar w:fldCharType="separate"/>
@@ -1640,7 +1640,7 @@
         <w:rPr>
           <w:color w:val="183F92"/>
         </w:rPr>
-        <w:t>Patent record</w:t>
+        <w:t>Grant certificate</w:t>
       </w:r>
       <w:r>
         <w:rPr>
@@ -2232,7 +2232,7 @@
         <w:t xml:space="preserve">Journal reviewer: </w:t>
       </w:r>
       <w:r>
-        <w:t>Journal of Hydrology; Acta Geotechnica; Bulletin of Engineering Geology and the Environment; Stochastic Environmental Research and Risk Assessment; Powder Technology; PLOS ONE; Applied Intelligence; Earth Science Informatics; Groundwater for Sustainable Development; International Journal of Computational Intelligence Systems; Journal of Rock Mechanics and Geotechnical Engineering; Air, Soil and Water Research; Discover Geoscience; Earth Sciences; Array; International Journal of Interactive Multimedia and Artificial Intelligence.</w:t>
+        <w:t>Journal of Hydrology; Acta Geotechnica; Bulletin of Engineering Geology and the Environment; Stochastic Environmental Research and Risk Assessment; Powder Technology; Scientific Reports; PLOS ONE; Applied Intelligence; Earth Science Informatics; Groundwater for Sustainable Development; International Journal of Computational Intelligence Systems; Journal of Rock Mechanics and Geotechnical Engineering; Air, Soil and Water Research; Discover Geoscience; Earth Sciences; Array; International Journal of Interactive Multimedia and Artificial Intelligence.</w:t>
       </w:r>
     </w:p>
     <w:p>

</xml_diff>